<commit_message>
Updated template file - typo fixes
</commit_message>
<xml_diff>
--- a/templates/templateFile.docx
+++ b/templates/templateFile.docx
@@ -95,7 +95,7 @@
       <w:tblPr>
         <w:tblW w:w="8792" w:type="dxa"/>
         <w:jc w:val="center"/>
-        <w:tblInd w:w="432" w:type="dxa"/>
+        <w:tblInd w:w="540" w:type="dxa"/>
         <w:tblBorders>
           <w:top w:val="single" w:color="ffffff" w:sz="8" w:space="0" w:shadow="0" w:frame="0"/>
           <w:left w:val="single" w:color="ffffff" w:sz="8" w:space="0" w:shadow="0" w:frame="0"/>
@@ -115,7 +115,7 @@
           <w:shd w:val="clear" w:color="auto" w:fill="ced7e7"/>
         </w:tblPrEx>
         <w:trPr>
-          <w:trHeight w:val="314" w:hRule="atLeast"/>
+          <w:trHeight w:val="334" w:hRule="atLeast"/>
         </w:trPr>
         <w:tc>
           <w:tcPr>
@@ -163,7 +163,7 @@
           <w:shd w:val="clear" w:color="auto" w:fill="ced7e7"/>
         </w:tblPrEx>
         <w:trPr>
-          <w:trHeight w:val="3434" w:hRule="atLeast"/>
+          <w:trHeight w:val="3454" w:hRule="atLeast"/>
         </w:trPr>
         <w:tc>
           <w:tcPr>
@@ -194,7 +194,7 @@
                 <w:bCs w:val="1"/>
                 <w:sz w:val="20"/>
                 <w:szCs w:val="20"/>
-                <w:lang w:val="en-US"/>
+                <w:shd w:val="nil" w:color="auto" w:fill="auto"/>
               </w:rPr>
             </w:pPr>
             <w:r>
@@ -214,22 +214,21 @@
           <w:p>
             <w:pPr>
               <w:pStyle w:val="Body A"/>
+              <w:bidi w:val="0"/>
               <w:spacing w:line="240" w:lineRule="auto"/>
-              <w:jc w:val="both"/>
-              <w:rPr>
-                <w:rFonts w:ascii="Helvetica Neue" w:cs="Helvetica Neue" w:hAnsi="Helvetica Neue" w:eastAsia="Helvetica Neue"/>
-                <w:b w:val="0"/>
-                <w:bCs w:val="0"/>
-                <w:sz w:val="20"/>
-                <w:szCs w:val="20"/>
-                <w:lang w:val="en-US"/>
-              </w:rPr>
-            </w:pPr>
-            <w:r>
-              <w:rPr>
-                <w:rFonts w:ascii="Helvetica Neue" w:hAnsi="Helvetica Neue"/>
-                <w:b w:val="0"/>
-                <w:bCs w:val="0"/>
+              <w:ind w:left="0" w:right="0" w:firstLine="0"/>
+              <w:jc w:val="both"/>
+              <w:rPr>
+                <w:rFonts w:ascii="Helvetica Neue" w:cs="Helvetica Neue" w:hAnsi="Helvetica Neue" w:eastAsia="Helvetica Neue"/>
+                <w:sz w:val="20"/>
+                <w:szCs w:val="20"/>
+                <w:shd w:val="nil" w:color="auto" w:fill="auto"/>
+                <w:rtl w:val="0"/>
+              </w:rPr>
+            </w:pPr>
+            <w:r>
+              <w:rPr>
+                <w:rFonts w:ascii="Helvetica Neue" w:hAnsi="Helvetica Neue"/>
                 <w:sz w:val="20"/>
                 <w:szCs w:val="20"/>
                 <w:shd w:val="nil" w:color="auto" w:fill="auto"/>
@@ -242,20 +241,24 @@
           <w:p>
             <w:pPr>
               <w:pStyle w:val="Body A"/>
+              <w:bidi w:val="0"/>
               <w:spacing w:line="240" w:lineRule="auto"/>
-              <w:jc w:val="both"/>
-              <w:rPr>
-                <w:rFonts w:ascii="Helvetica Neue" w:cs="Helvetica Neue" w:hAnsi="Helvetica Neue" w:eastAsia="Helvetica Neue"/>
-                <w:sz w:val="20"/>
-                <w:szCs w:val="20"/>
-                <w:lang w:val="en-US"/>
-              </w:rPr>
-            </w:pPr>
-            <w:r>
-              <w:rPr>
-                <w:rFonts w:ascii="Helvetica Neue" w:hAnsi="Helvetica Neue"/>
-                <w:sz w:val="20"/>
-                <w:szCs w:val="20"/>
+              <w:ind w:left="0" w:right="0" w:firstLine="0"/>
+              <w:jc w:val="both"/>
+              <w:rPr>
+                <w:rFonts w:ascii="Helvetica Neue" w:cs="Helvetica Neue" w:hAnsi="Helvetica Neue" w:eastAsia="Helvetica Neue"/>
+                <w:sz w:val="20"/>
+                <w:szCs w:val="20"/>
+                <w:shd w:val="nil" w:color="auto" w:fill="auto"/>
+                <w:rtl w:val="0"/>
+              </w:rPr>
+            </w:pPr>
+            <w:r>
+              <w:rPr>
+                <w:rFonts w:ascii="Helvetica Neue" w:hAnsi="Helvetica Neue"/>
+                <w:sz w:val="20"/>
+                <w:szCs w:val="20"/>
+                <w:shd w:val="nil" w:color="auto" w:fill="auto"/>
                 <w:rtl w:val="0"/>
                 <w:lang w:val="en-US"/>
               </w:rPr>
@@ -265,20 +268,24 @@
           <w:p>
             <w:pPr>
               <w:pStyle w:val="Body A"/>
+              <w:bidi w:val="0"/>
               <w:spacing w:line="240" w:lineRule="auto"/>
-              <w:jc w:val="both"/>
-              <w:rPr>
-                <w:rFonts w:ascii="Helvetica Neue" w:cs="Helvetica Neue" w:hAnsi="Helvetica Neue" w:eastAsia="Helvetica Neue"/>
-                <w:sz w:val="20"/>
-                <w:szCs w:val="20"/>
-                <w:lang w:val="en-US"/>
-              </w:rPr>
-            </w:pPr>
-            <w:r>
-              <w:rPr>
-                <w:rFonts w:ascii="Helvetica Neue" w:hAnsi="Helvetica Neue"/>
-                <w:sz w:val="20"/>
-                <w:szCs w:val="20"/>
+              <w:ind w:left="0" w:right="0" w:firstLine="0"/>
+              <w:jc w:val="both"/>
+              <w:rPr>
+                <w:rFonts w:ascii="Helvetica Neue" w:cs="Helvetica Neue" w:hAnsi="Helvetica Neue" w:eastAsia="Helvetica Neue"/>
+                <w:sz w:val="20"/>
+                <w:szCs w:val="20"/>
+                <w:shd w:val="nil" w:color="auto" w:fill="auto"/>
+                <w:rtl w:val="0"/>
+              </w:rPr>
+            </w:pPr>
+            <w:r>
+              <w:rPr>
+                <w:rFonts w:ascii="Helvetica Neue" w:hAnsi="Helvetica Neue"/>
+                <w:sz w:val="20"/>
+                <w:szCs w:val="20"/>
+                <w:shd w:val="nil" w:color="auto" w:fill="auto"/>
                 <w:rtl w:val="0"/>
                 <w:lang w:val="en-US"/>
               </w:rPr>
@@ -288,20 +295,24 @@
           <w:p>
             <w:pPr>
               <w:pStyle w:val="Body A"/>
+              <w:bidi w:val="0"/>
               <w:spacing w:line="240" w:lineRule="auto"/>
-              <w:jc w:val="both"/>
-              <w:rPr>
-                <w:rFonts w:ascii="Helvetica Neue" w:cs="Helvetica Neue" w:hAnsi="Helvetica Neue" w:eastAsia="Helvetica Neue"/>
-                <w:sz w:val="20"/>
-                <w:szCs w:val="20"/>
-                <w:lang w:val="en-US"/>
-              </w:rPr>
-            </w:pPr>
-            <w:r>
-              <w:rPr>
-                <w:rFonts w:ascii="Helvetica Neue" w:hAnsi="Helvetica Neue"/>
-                <w:sz w:val="20"/>
-                <w:szCs w:val="20"/>
+              <w:ind w:left="0" w:right="0" w:firstLine="0"/>
+              <w:jc w:val="both"/>
+              <w:rPr>
+                <w:rFonts w:ascii="Helvetica Neue" w:cs="Helvetica Neue" w:hAnsi="Helvetica Neue" w:eastAsia="Helvetica Neue"/>
+                <w:sz w:val="20"/>
+                <w:szCs w:val="20"/>
+                <w:shd w:val="nil" w:color="auto" w:fill="auto"/>
+                <w:rtl w:val="0"/>
+              </w:rPr>
+            </w:pPr>
+            <w:r>
+              <w:rPr>
+                <w:rFonts w:ascii="Helvetica Neue" w:hAnsi="Helvetica Neue"/>
+                <w:sz w:val="20"/>
+                <w:szCs w:val="20"/>
+                <w:shd w:val="nil" w:color="auto" w:fill="auto"/>
                 <w:rtl w:val="0"/>
                 <w:lang w:val="en-US"/>
               </w:rPr>
@@ -311,20 +322,24 @@
           <w:p>
             <w:pPr>
               <w:pStyle w:val="Body A"/>
+              <w:bidi w:val="0"/>
               <w:spacing w:line="240" w:lineRule="auto"/>
-              <w:jc w:val="both"/>
-              <w:rPr>
-                <w:rFonts w:ascii="Helvetica Neue" w:cs="Helvetica Neue" w:hAnsi="Helvetica Neue" w:eastAsia="Helvetica Neue"/>
-                <w:sz w:val="20"/>
-                <w:szCs w:val="20"/>
-                <w:shd w:val="nil" w:color="auto" w:fill="auto"/>
-              </w:rPr>
-            </w:pPr>
-            <w:r>
-              <w:rPr>
-                <w:rFonts w:ascii="Helvetica Neue" w:hAnsi="Helvetica Neue"/>
-                <w:sz w:val="20"/>
-                <w:szCs w:val="20"/>
+              <w:ind w:left="0" w:right="0" w:firstLine="0"/>
+              <w:jc w:val="both"/>
+              <w:rPr>
+                <w:rFonts w:ascii="Helvetica Neue" w:cs="Helvetica Neue" w:hAnsi="Helvetica Neue" w:eastAsia="Helvetica Neue"/>
+                <w:sz w:val="20"/>
+                <w:szCs w:val="20"/>
+                <w:shd w:val="nil" w:color="auto" w:fill="auto"/>
+                <w:rtl w:val="0"/>
+              </w:rPr>
+            </w:pPr>
+            <w:r>
+              <w:rPr>
+                <w:rFonts w:ascii="Helvetica Neue" w:hAnsi="Helvetica Neue"/>
+                <w:sz w:val="20"/>
+                <w:szCs w:val="20"/>
+                <w:shd w:val="nil" w:color="auto" w:fill="auto"/>
                 <w:rtl w:val="0"/>
                 <w:lang w:val="en-US"/>
               </w:rPr>
@@ -359,8 +374,8 @@
                 <w:bCs w:val="1"/>
                 <w:sz w:val="20"/>
                 <w:szCs w:val="20"/>
-                <w:rtl w:val="0"/>
-                <w:lang w:val="en-US"/>
+                <w:shd w:val="nil" w:color="auto" w:fill="auto"/>
+                <w:rtl w:val="0"/>
               </w:rPr>
             </w:pPr>
             <w:r>
@@ -388,15 +403,16 @@
                 <w:rFonts w:ascii="Helvetica Neue" w:cs="Helvetica Neue" w:hAnsi="Helvetica Neue" w:eastAsia="Helvetica Neue"/>
                 <w:sz w:val="20"/>
                 <w:szCs w:val="20"/>
-                <w:rtl w:val="0"/>
-                <w:lang w:val="en-US"/>
-              </w:rPr>
-            </w:pPr>
-            <w:r>
-              <w:rPr>
-                <w:rFonts w:ascii="Helvetica Neue" w:hAnsi="Helvetica Neue"/>
-                <w:sz w:val="20"/>
-                <w:szCs w:val="20"/>
+                <w:shd w:val="nil" w:color="auto" w:fill="auto"/>
+                <w:rtl w:val="0"/>
+              </w:rPr>
+            </w:pPr>
+            <w:r>
+              <w:rPr>
+                <w:rFonts w:ascii="Helvetica Neue" w:hAnsi="Helvetica Neue"/>
+                <w:sz w:val="20"/>
+                <w:szCs w:val="20"/>
+                <w:shd w:val="nil" w:color="auto" w:fill="auto"/>
                 <w:rtl w:val="0"/>
                 <w:lang w:val="en-US"/>
               </w:rPr>
@@ -423,6 +439,7 @@
                 <w:rFonts w:ascii="Helvetica Neue" w:hAnsi="Helvetica Neue"/>
                 <w:sz w:val="20"/>
                 <w:szCs w:val="20"/>
+                <w:shd w:val="nil" w:color="auto" w:fill="auto"/>
                 <w:rtl w:val="0"/>
                 <w:lang w:val="en-US"/>
               </w:rPr>
@@ -456,8 +473,8 @@
                 <w:bCs w:val="1"/>
                 <w:sz w:val="20"/>
                 <w:szCs w:val="20"/>
-                <w:rtl w:val="0"/>
-                <w:lang w:val="en-US"/>
+                <w:shd w:val="nil" w:color="auto" w:fill="auto"/>
+                <w:rtl w:val="0"/>
               </w:rPr>
             </w:pPr>
             <w:r>
@@ -501,6 +518,7 @@
                 <w:rFonts w:ascii="Helvetica Neue" w:hAnsi="Helvetica Neue"/>
                 <w:sz w:val="20"/>
                 <w:szCs w:val="20"/>
+                <w:shd w:val="nil" w:color="auto" w:fill="auto"/>
                 <w:rtl w:val="0"/>
                 <w:lang w:val="en-US"/>
               </w:rPr>
@@ -510,6 +528,22 @@
         </w:tc>
       </w:tr>
     </w:tbl>
+    <w:p>
+      <w:pPr>
+        <w:pStyle w:val="Body A"/>
+        <w:widowControl w:val="0"/>
+        <w:spacing w:line="240" w:lineRule="auto"/>
+        <w:ind w:left="432" w:hanging="432"/>
+        <w:jc w:val="center"/>
+        <w:rPr>
+          <w:rFonts w:ascii="Helvetica Neue" w:cs="Helvetica Neue" w:hAnsi="Helvetica Neue" w:eastAsia="Helvetica Neue"/>
+          <w:b w:val="1"/>
+          <w:bCs w:val="1"/>
+          <w:sz w:val="20"/>
+          <w:szCs w:val="20"/>
+        </w:rPr>
+      </w:pPr>
+    </w:p>
     <w:p>
       <w:pPr>
         <w:pStyle w:val="Body A"/>
@@ -603,7 +637,7 @@
       <w:tblPr>
         <w:tblW w:w="8800" w:type="dxa"/>
         <w:jc w:val="center"/>
-        <w:tblInd w:w="432" w:type="dxa"/>
+        <w:tblInd w:w="540" w:type="dxa"/>
         <w:tblBorders>
           <w:top w:val="single" w:color="ffffff" w:sz="8" w:space="0" w:shadow="0" w:frame="0"/>
           <w:left w:val="single" w:color="ffffff" w:sz="8" w:space="0" w:shadow="0" w:frame="0"/>
@@ -623,7 +657,7 @@
           <w:shd w:val="clear" w:color="auto" w:fill="ced7e7"/>
         </w:tblPrEx>
         <w:trPr>
-          <w:trHeight w:val="314" w:hRule="atLeast"/>
+          <w:trHeight w:val="334" w:hRule="atLeast"/>
         </w:trPr>
         <w:tc>
           <w:tcPr>
@@ -671,7 +705,7 @@
           <w:shd w:val="clear" w:color="auto" w:fill="ced7e7"/>
         </w:tblPrEx>
         <w:trPr>
-          <w:trHeight w:val="10258" w:hRule="atLeast"/>
+          <w:trHeight w:val="10278" w:hRule="atLeast"/>
         </w:trPr>
         <w:tc>
           <w:tcPr>
@@ -863,8 +897,8 @@
                 <w:bCs w:val="1"/>
                 <w:sz w:val="20"/>
                 <w:szCs w:val="20"/>
-                <w:rtl w:val="0"/>
-                <w:lang w:val="en-US"/>
+                <w:shd w:val="nil" w:color="auto" w:fill="auto"/>
+                <w:rtl w:val="0"/>
               </w:rPr>
             </w:pPr>
             <w:r>
@@ -894,74 +928,22 @@
                 <w:bCs w:val="1"/>
                 <w:sz w:val="20"/>
                 <w:szCs w:val="20"/>
-                <w:rtl w:val="0"/>
-                <w:lang w:val="en-US"/>
-              </w:rPr>
-            </w:pPr>
-            <w:r>
-              <w:rPr>
-                <w:rFonts w:ascii="Helvetica Neue" w:hAnsi="Helvetica Neue"/>
-                <w:b w:val="1"/>
-                <w:bCs w:val="1"/>
-                <w:sz w:val="20"/>
-                <w:szCs w:val="20"/>
-                <w:shd w:val="nil" w:color="auto" w:fill="auto"/>
-                <w:rtl w:val="0"/>
-                <w:lang w:val="en-US"/>
-              </w:rPr>
-              <w:t>Continue to use Monarch Money via our sponsored account</w:t>
-            </w:r>
-            <w:r>
-              <w:rPr>
-                <w:rFonts w:ascii="Helvetica Neue" w:hAnsi="Helvetica Neue"/>
-                <w:b w:val="1"/>
-                <w:bCs w:val="1"/>
-                <w:sz w:val="20"/>
-                <w:szCs w:val="20"/>
-                <w:shd w:val="nil" w:color="auto" w:fill="auto"/>
-                <w:rtl w:val="0"/>
-                <w:lang w:val="en-US"/>
-              </w:rPr>
-              <w:t xml:space="preserve">. Load the app on your phone. </w:t>
-            </w:r>
-            <w:r>
-              <w:rPr>
-                <w:rFonts w:ascii="Helvetica Neue" w:hAnsi="Helvetica Neue"/>
-                <w:b w:val="1"/>
-                <w:bCs w:val="1"/>
-                <w:sz w:val="20"/>
-                <w:szCs w:val="20"/>
-                <w:shd w:val="nil" w:color="auto" w:fill="auto"/>
-                <w:rtl w:val="0"/>
-                <w:lang w:val="en-US"/>
-              </w:rPr>
-              <w:t xml:space="preserve">Target spending </w:t>
-            </w:r>
-            <w:r>
-              <w:rPr>
-                <w:rFonts w:ascii="Helvetica Neue" w:hAnsi="Helvetica Neue"/>
-                <w:b w:val="1"/>
-                <w:bCs w:val="1"/>
-                <w:sz w:val="20"/>
-                <w:szCs w:val="20"/>
-                <w:shd w:val="nil" w:color="auto" w:fill="auto"/>
-                <w:rtl w:val="0"/>
-                <w:lang w:val="en-US"/>
-              </w:rPr>
-              <w:t>{12}</w:t>
-            </w:r>
-            <w:r>
-              <w:rPr>
-                <w:rFonts w:ascii="Helvetica Neue" w:hAnsi="Helvetica Neue"/>
-                <w:b w:val="1"/>
-                <w:bCs w:val="1"/>
-                <w:sz w:val="20"/>
-                <w:szCs w:val="20"/>
-                <w:shd w:val="nil" w:color="auto" w:fill="auto"/>
-                <w:rtl w:val="0"/>
-                <w:lang w:val="en-US"/>
-              </w:rPr>
-              <w:t xml:space="preserve"> per month </w:t>
+                <w:shd w:val="nil" w:color="auto" w:fill="auto"/>
+                <w:rtl w:val="0"/>
+              </w:rPr>
+            </w:pPr>
+            <w:r>
+              <w:rPr>
+                <w:rFonts w:ascii="Helvetica Neue" w:hAnsi="Helvetica Neue"/>
+                <w:b w:val="1"/>
+                <w:bCs w:val="1"/>
+                <w:sz w:val="20"/>
+                <w:szCs w:val="20"/>
+                <w:shd w:val="nil" w:color="auto" w:fill="auto"/>
+                <w:rtl w:val="0"/>
+                <w:lang w:val="en-US"/>
+              </w:rPr>
+              <w:t xml:space="preserve">Continue to use Monarch Money via our sponsored account. Load the app on your phone. Target spending {12} per month </w:t>
             </w:r>
             <w:r>
               <w:rPr>
@@ -988,59 +970,7 @@
                 <w:rtl w:val="0"/>
                 <w:lang w:val="en-US"/>
               </w:rPr>
-              <w:t xml:space="preserve"> including property taxes and travel</w:t>
-            </w:r>
-            <w:r>
-              <w:rPr>
-                <w:rFonts w:ascii="Helvetica Neue" w:hAnsi="Helvetica Neue"/>
-                <w:b w:val="1"/>
-                <w:bCs w:val="1"/>
-                <w:sz w:val="20"/>
-                <w:szCs w:val="20"/>
-                <w:shd w:val="nil" w:color="auto" w:fill="auto"/>
-                <w:rtl w:val="0"/>
-                <w:lang w:val="en-US"/>
-              </w:rPr>
-              <w:t xml:space="preserve">. Total spending with property taxes and travel is {13} </w:t>
-            </w:r>
-            <w:r>
-              <w:rPr>
-                <w:rFonts w:ascii="Helvetica Neue" w:hAnsi="Helvetica Neue"/>
-                <w:b w:val="1"/>
-                <w:bCs w:val="1"/>
-                <w:sz w:val="20"/>
-                <w:szCs w:val="20"/>
-                <w:shd w:val="nil" w:color="auto" w:fill="auto"/>
-                <w:rtl w:val="0"/>
-                <w:lang w:val="en-US"/>
-              </w:rPr>
-              <w:t xml:space="preserve">per month or </w:t>
-            </w:r>
-            <w:r>
-              <w:rPr>
-                <w:rFonts w:ascii="Helvetica Neue" w:hAnsi="Helvetica Neue"/>
-                <w:b w:val="1"/>
-                <w:bCs w:val="1"/>
-                <w:sz w:val="20"/>
-                <w:szCs w:val="20"/>
-                <w:shd w:val="nil" w:color="auto" w:fill="auto"/>
-                <w:rtl w:val="0"/>
-                <w:lang w:val="en-US"/>
-              </w:rPr>
-              <w:t>{14}</w:t>
-            </w:r>
-            <w:r>
-              <w:rPr>
-                <w:rFonts w:ascii="Helvetica Neue" w:hAnsi="Helvetica Neue"/>
-                <w:b w:val="1"/>
-                <w:bCs w:val="1"/>
-                <w:sz w:val="20"/>
-                <w:szCs w:val="20"/>
-                <w:shd w:val="nil" w:color="auto" w:fill="auto"/>
-                <w:rtl w:val="0"/>
-                <w:lang w:val="en-US"/>
-              </w:rPr>
-              <w:t xml:space="preserve"> per year. </w:t>
+              <w:t xml:space="preserve"> including property taxes and travel. Total spending with property taxes and travel is {13} per month or {14} per year. </w:t>
             </w:r>
           </w:p>
           <w:p>
@@ -1056,8 +986,8 @@
                 <w:bCs w:val="1"/>
                 <w:sz w:val="20"/>
                 <w:szCs w:val="20"/>
-                <w:rtl w:val="0"/>
-                <w:lang w:val="en-US"/>
+                <w:shd w:val="nil" w:color="auto" w:fill="auto"/>
+                <w:rtl w:val="0"/>
               </w:rPr>
             </w:pPr>
             <w:r>
@@ -1123,20 +1053,7 @@
                 <w:rtl w:val="0"/>
                 <w:lang w:val="en-US"/>
               </w:rPr>
-              <w:t>tab</w:t>
-            </w:r>
-            <w:r>
-              <w:rPr>
-                <w:rFonts w:ascii="Helvetica Neue" w:hAnsi="Helvetica Neue"/>
-                <w:b w:val="1"/>
-                <w:bCs w:val="1"/>
-                <w:sz w:val="20"/>
-                <w:szCs w:val="20"/>
-                <w:shd w:val="nil" w:color="auto" w:fill="auto"/>
-                <w:rtl w:val="0"/>
-                <w:lang w:val="en-US"/>
-              </w:rPr>
-              <w:t xml:space="preserve"> &gt;&gt; click </w:t>
+              <w:t xml:space="preserve">tab &gt;&gt; click </w:t>
             </w:r>
             <w:r>
               <w:rPr>
@@ -1204,8 +1121,8 @@
                 <w:bCs w:val="1"/>
                 <w:sz w:val="20"/>
                 <w:szCs w:val="20"/>
-                <w:rtl w:val="0"/>
-                <w:lang w:val="en-US"/>
+                <w:shd w:val="nil" w:color="auto" w:fill="auto"/>
+                <w:rtl w:val="0"/>
               </w:rPr>
             </w:pPr>
             <w:r>
@@ -1235,8 +1152,8 @@
                 <w:bCs w:val="1"/>
                 <w:sz w:val="20"/>
                 <w:szCs w:val="20"/>
-                <w:rtl w:val="0"/>
-                <w:lang w:val="en-US"/>
+                <w:shd w:val="nil" w:color="auto" w:fill="auto"/>
+                <w:rtl w:val="0"/>
               </w:rPr>
             </w:pPr>
             <w:r>
@@ -1318,8 +1235,8 @@
                 <w:bCs w:val="1"/>
                 <w:sz w:val="20"/>
                 <w:szCs w:val="20"/>
-                <w:rtl w:val="0"/>
-                <w:lang w:val="en-US"/>
+                <w:shd w:val="nil" w:color="auto" w:fill="auto"/>
+                <w:rtl w:val="0"/>
               </w:rPr>
             </w:pPr>
             <w:r>
@@ -1349,8 +1266,8 @@
                 <w:bCs w:val="1"/>
                 <w:sz w:val="20"/>
                 <w:szCs w:val="20"/>
-                <w:rtl w:val="0"/>
-                <w:lang w:val="en-US"/>
+                <w:shd w:val="nil" w:color="auto" w:fill="auto"/>
+                <w:rtl w:val="0"/>
               </w:rPr>
             </w:pPr>
             <w:r>
@@ -1416,72 +1333,7 @@
                 <w:rtl w:val="0"/>
                 <w:lang w:val="en-US"/>
               </w:rPr>
-              <w:t xml:space="preserve">tab, </w:t>
-            </w:r>
-            <w:r>
-              <w:rPr>
-                <w:rFonts w:ascii="Helvetica Neue" w:hAnsi="Helvetica Neue"/>
-                <w:b w:val="1"/>
-                <w:bCs w:val="1"/>
-                <w:sz w:val="20"/>
-                <w:szCs w:val="20"/>
-                <w:shd w:val="nil" w:color="auto" w:fill="auto"/>
-                <w:rtl w:val="0"/>
-                <w:lang w:val="en-US"/>
-              </w:rPr>
-              <w:t xml:space="preserve">input the </w:t>
-            </w:r>
-            <w:r>
-              <w:rPr>
-                <w:rFonts w:ascii="Helvetica Neue" w:hAnsi="Helvetica Neue"/>
-                <w:b w:val="1"/>
-                <w:bCs w:val="1"/>
-                <w:sz w:val="20"/>
-                <w:szCs w:val="20"/>
-                <w:shd w:val="nil" w:color="auto" w:fill="auto"/>
-                <w:rtl w:val="0"/>
-                <w:lang w:val="en-US"/>
-              </w:rPr>
-              <w:t>blue line items</w:t>
-            </w:r>
-            <w:r>
-              <w:rPr>
-                <w:rFonts w:ascii="Helvetica Neue" w:hAnsi="Helvetica Neue"/>
-                <w:b w:val="1"/>
-                <w:bCs w:val="1"/>
-                <w:sz w:val="20"/>
-                <w:szCs w:val="20"/>
-                <w:shd w:val="nil" w:color="auto" w:fill="auto"/>
-                <w:rtl w:val="0"/>
-                <w:lang w:val="en-US"/>
-              </w:rPr>
-              <w:t xml:space="preserve"> from the </w:t>
-            </w:r>
-            <w:r>
-              <w:rPr>
-                <w:rFonts w:ascii="Helvetica Neue" w:hAnsi="Helvetica Neue"/>
-                <w:b w:val="1"/>
-                <w:bCs w:val="1"/>
-                <w:sz w:val="20"/>
-                <w:szCs w:val="20"/>
-                <w:shd w:val="nil" w:color="auto" w:fill="auto"/>
-                <w:rtl w:val="0"/>
-                <w:lang w:val="en-US"/>
-              </w:rPr>
-              <w:t xml:space="preserve">spending plan </w:t>
-            </w:r>
-            <w:r>
-              <w:rPr>
-                <w:rFonts w:ascii="Helvetica Neue" w:hAnsi="Helvetica Neue"/>
-                <w:b w:val="1"/>
-                <w:bCs w:val="1"/>
-                <w:sz w:val="20"/>
-                <w:szCs w:val="20"/>
-                <w:shd w:val="nil" w:color="auto" w:fill="auto"/>
-                <w:rtl w:val="0"/>
-                <w:lang w:val="en-US"/>
-              </w:rPr>
-              <w:t xml:space="preserve">as your budgets. </w:t>
+              <w:t xml:space="preserve">tab, input the blue line items from the spending plan as your budgets. </w:t>
             </w:r>
           </w:p>
           <w:p>
@@ -1497,61 +1349,22 @@
                 <w:bCs w:val="1"/>
                 <w:sz w:val="20"/>
                 <w:szCs w:val="20"/>
-                <w:rtl w:val="0"/>
-                <w:lang w:val="en-US"/>
-              </w:rPr>
-            </w:pPr>
-            <w:r>
-              <w:rPr>
-                <w:rFonts w:ascii="Helvetica Neue" w:hAnsi="Helvetica Neue"/>
-                <w:b w:val="1"/>
-                <w:bCs w:val="1"/>
-                <w:sz w:val="20"/>
-                <w:szCs w:val="20"/>
-                <w:shd w:val="nil" w:color="auto" w:fill="auto"/>
-                <w:rtl w:val="0"/>
-                <w:lang w:val="en-US"/>
-              </w:rPr>
-              <w:t xml:space="preserve">Target food spending </w:t>
-            </w:r>
-            <w:r>
-              <w:rPr>
-                <w:rFonts w:ascii="Helvetica Neue" w:hAnsi="Helvetica Neue"/>
-                <w:b w:val="1"/>
-                <w:bCs w:val="1"/>
-                <w:sz w:val="20"/>
-                <w:szCs w:val="20"/>
-                <w:shd w:val="nil" w:color="auto" w:fill="auto"/>
-                <w:rtl w:val="0"/>
-                <w:lang w:val="en-US"/>
-              </w:rPr>
-              <w:t>~</w:t>
-            </w:r>
-            <w:r>
-              <w:rPr>
-                <w:rFonts w:ascii="Helvetica Neue" w:hAnsi="Helvetica Neue"/>
-                <w:b w:val="1"/>
-                <w:bCs w:val="1"/>
-                <w:sz w:val="20"/>
-                <w:szCs w:val="20"/>
-                <w:shd w:val="nil" w:color="auto" w:fill="auto"/>
-                <w:rtl w:val="0"/>
-                <w:lang w:val="en-US"/>
-              </w:rPr>
-              <w:t>{15}</w:t>
-            </w:r>
-            <w:r>
-              <w:rPr>
-                <w:rFonts w:ascii="Helvetica Neue" w:hAnsi="Helvetica Neue"/>
-                <w:b w:val="1"/>
-                <w:bCs w:val="1"/>
-                <w:sz w:val="20"/>
-                <w:szCs w:val="20"/>
-                <w:shd w:val="nil" w:color="auto" w:fill="auto"/>
-                <w:rtl w:val="0"/>
-                <w:lang w:val="en-US"/>
-              </w:rPr>
-              <w:t>/month.</w:t>
+                <w:shd w:val="nil" w:color="auto" w:fill="auto"/>
+                <w:rtl w:val="0"/>
+              </w:rPr>
+            </w:pPr>
+            <w:r>
+              <w:rPr>
+                <w:rFonts w:ascii="Helvetica Neue" w:hAnsi="Helvetica Neue"/>
+                <w:b w:val="1"/>
+                <w:bCs w:val="1"/>
+                <w:sz w:val="20"/>
+                <w:szCs w:val="20"/>
+                <w:shd w:val="nil" w:color="auto" w:fill="auto"/>
+                <w:rtl w:val="0"/>
+                <w:lang w:val="en-US"/>
+              </w:rPr>
+              <w:t>Target food spending ~{15}/month.</w:t>
             </w:r>
           </w:p>
           <w:p>
@@ -1567,61 +1380,22 @@
                 <w:bCs w:val="1"/>
                 <w:sz w:val="20"/>
                 <w:szCs w:val="20"/>
-                <w:rtl w:val="0"/>
-                <w:lang w:val="en-US"/>
-              </w:rPr>
-            </w:pPr>
-            <w:r>
-              <w:rPr>
-                <w:rFonts w:ascii="Helvetica Neue" w:hAnsi="Helvetica Neue"/>
-                <w:b w:val="1"/>
-                <w:bCs w:val="1"/>
-                <w:sz w:val="20"/>
-                <w:szCs w:val="20"/>
-                <w:shd w:val="nil" w:color="auto" w:fill="auto"/>
-                <w:rtl w:val="0"/>
-                <w:lang w:val="en-US"/>
-              </w:rPr>
-              <w:t xml:space="preserve">Target shopping </w:t>
-            </w:r>
-            <w:r>
-              <w:rPr>
-                <w:rFonts w:ascii="Helvetica Neue" w:hAnsi="Helvetica Neue"/>
-                <w:b w:val="1"/>
-                <w:bCs w:val="1"/>
-                <w:sz w:val="20"/>
-                <w:szCs w:val="20"/>
-                <w:shd w:val="nil" w:color="auto" w:fill="auto"/>
-                <w:rtl w:val="0"/>
-                <w:lang w:val="en-US"/>
-              </w:rPr>
-              <w:t>~</w:t>
-            </w:r>
-            <w:r>
-              <w:rPr>
-                <w:rFonts w:ascii="Helvetica Neue" w:hAnsi="Helvetica Neue"/>
-                <w:b w:val="1"/>
-                <w:bCs w:val="1"/>
-                <w:sz w:val="20"/>
-                <w:szCs w:val="20"/>
-                <w:shd w:val="nil" w:color="auto" w:fill="auto"/>
-                <w:rtl w:val="0"/>
-                <w:lang w:val="en-US"/>
-              </w:rPr>
-              <w:t>{16}</w:t>
-            </w:r>
-            <w:r>
-              <w:rPr>
-                <w:rFonts w:ascii="Helvetica Neue" w:hAnsi="Helvetica Neue"/>
-                <w:b w:val="1"/>
-                <w:bCs w:val="1"/>
-                <w:sz w:val="20"/>
-                <w:szCs w:val="20"/>
-                <w:shd w:val="nil" w:color="auto" w:fill="auto"/>
-                <w:rtl w:val="0"/>
-                <w:lang w:val="en-US"/>
-              </w:rPr>
-              <w:t>/month.</w:t>
+                <w:shd w:val="nil" w:color="auto" w:fill="auto"/>
+                <w:rtl w:val="0"/>
+              </w:rPr>
+            </w:pPr>
+            <w:r>
+              <w:rPr>
+                <w:rFonts w:ascii="Helvetica Neue" w:hAnsi="Helvetica Neue"/>
+                <w:b w:val="1"/>
+                <w:bCs w:val="1"/>
+                <w:sz w:val="20"/>
+                <w:szCs w:val="20"/>
+                <w:shd w:val="nil" w:color="auto" w:fill="auto"/>
+                <w:rtl w:val="0"/>
+                <w:lang w:val="en-US"/>
+              </w:rPr>
+              <w:t>Target shopping ~{16}/month.</w:t>
             </w:r>
           </w:p>
           <w:p>
@@ -1637,35 +1411,48 @@
                 <w:bCs w:val="1"/>
                 <w:sz w:val="20"/>
                 <w:szCs w:val="20"/>
-                <w:rtl w:val="0"/>
-                <w:lang w:val="en-US"/>
-              </w:rPr>
-            </w:pPr>
-            <w:r>
-              <w:rPr>
-                <w:rFonts w:ascii="Helvetica Neue" w:hAnsi="Helvetica Neue"/>
-                <w:b w:val="1"/>
-                <w:bCs w:val="1"/>
-                <w:sz w:val="20"/>
-                <w:szCs w:val="20"/>
-                <w:shd w:val="nil" w:color="auto" w:fill="auto"/>
-                <w:rtl w:val="0"/>
-                <w:lang w:val="en-US"/>
-              </w:rPr>
-              <w:t>Target annual Travel ~{17}</w:t>
-            </w:r>
-            <w:r>
-              <w:rPr>
-                <w:rFonts w:ascii="Helvetica Neue" w:hAnsi="Helvetica Neue"/>
-                <w:b w:val="1"/>
-                <w:bCs w:val="1"/>
-                <w:sz w:val="20"/>
-                <w:szCs w:val="20"/>
-                <w:shd w:val="nil" w:color="auto" w:fill="auto"/>
-                <w:rtl w:val="0"/>
-                <w:lang w:val="en-US"/>
-              </w:rPr>
-              <w:t>/year.</w:t>
+                <w:shd w:val="nil" w:color="auto" w:fill="auto"/>
+                <w:rtl w:val="0"/>
+              </w:rPr>
+            </w:pPr>
+            <w:r>
+              <w:rPr>
+                <w:rFonts w:ascii="Helvetica Neue" w:hAnsi="Helvetica Neue"/>
+                <w:b w:val="1"/>
+                <w:bCs w:val="1"/>
+                <w:sz w:val="20"/>
+                <w:szCs w:val="20"/>
+                <w:shd w:val="nil" w:color="auto" w:fill="auto"/>
+                <w:rtl w:val="0"/>
+                <w:lang w:val="en-US"/>
+              </w:rPr>
+              <w:t xml:space="preserve">Target annual </w:t>
+            </w:r>
+            <w:r>
+              <w:rPr>
+                <w:rFonts w:ascii="Helvetica Neue" w:hAnsi="Helvetica Neue"/>
+                <w:b w:val="1"/>
+                <w:bCs w:val="1"/>
+                <w:sz w:val="20"/>
+                <w:szCs w:val="20"/>
+                <w:shd w:val="nil" w:color="auto" w:fill="auto"/>
+                <w:rtl w:val="0"/>
+                <w:lang w:val="en-US"/>
+              </w:rPr>
+              <w:t>t</w:t>
+            </w:r>
+            <w:r>
+              <w:rPr>
+                <w:rFonts w:ascii="Helvetica Neue" w:hAnsi="Helvetica Neue"/>
+                <w:b w:val="1"/>
+                <w:bCs w:val="1"/>
+                <w:sz w:val="20"/>
+                <w:szCs w:val="20"/>
+                <w:shd w:val="nil" w:color="auto" w:fill="auto"/>
+                <w:rtl w:val="0"/>
+                <w:lang w:val="en-US"/>
+              </w:rPr>
+              <w:t>ravel ~{17}/year.</w:t>
             </w:r>
           </w:p>
           <w:p>
@@ -1681,35 +1468,22 @@
                 <w:bCs w:val="1"/>
                 <w:sz w:val="20"/>
                 <w:szCs w:val="20"/>
-                <w:rtl w:val="0"/>
-                <w:lang w:val="en-US"/>
-              </w:rPr>
-            </w:pPr>
-            <w:r>
-              <w:rPr>
-                <w:rFonts w:ascii="Helvetica Neue" w:hAnsi="Helvetica Neue"/>
-                <w:b w:val="1"/>
-                <w:bCs w:val="1"/>
-                <w:sz w:val="20"/>
-                <w:szCs w:val="20"/>
-                <w:shd w:val="nil" w:color="auto" w:fill="auto"/>
-                <w:rtl w:val="0"/>
-                <w:lang w:val="en-US"/>
-              </w:rPr>
-              <w:t>Target entertainment ~{18}</w:t>
-            </w:r>
-            <w:r>
-              <w:rPr>
-                <w:rFonts w:ascii="Helvetica Neue" w:hAnsi="Helvetica Neue"/>
-                <w:b w:val="1"/>
-                <w:bCs w:val="1"/>
-                <w:sz w:val="20"/>
-                <w:szCs w:val="20"/>
-                <w:shd w:val="nil" w:color="auto" w:fill="auto"/>
-                <w:rtl w:val="0"/>
-                <w:lang w:val="en-US"/>
-              </w:rPr>
-              <w:t>/month.</w:t>
+                <w:shd w:val="nil" w:color="auto" w:fill="auto"/>
+                <w:rtl w:val="0"/>
+              </w:rPr>
+            </w:pPr>
+            <w:r>
+              <w:rPr>
+                <w:rFonts w:ascii="Helvetica Neue" w:hAnsi="Helvetica Neue"/>
+                <w:b w:val="1"/>
+                <w:bCs w:val="1"/>
+                <w:sz w:val="20"/>
+                <w:szCs w:val="20"/>
+                <w:shd w:val="nil" w:color="auto" w:fill="auto"/>
+                <w:rtl w:val="0"/>
+                <w:lang w:val="en-US"/>
+              </w:rPr>
+              <w:t>Target entertainment ~{18}/month.</w:t>
             </w:r>
           </w:p>
           <w:p>
@@ -1734,25 +1508,106 @@
                 <w:rtl w:val="0"/>
                 <w:lang w:val="en-US"/>
               </w:rPr>
-              <w:t>Target Health/Personal Care ~{19}</w:t>
-            </w:r>
-            <w:r>
-              <w:rPr>
-                <w:rFonts w:ascii="Helvetica Neue" w:hAnsi="Helvetica Neue"/>
-                <w:b w:val="1"/>
-                <w:bCs w:val="1"/>
-                <w:sz w:val="20"/>
-                <w:szCs w:val="20"/>
-                <w:shd w:val="nil" w:color="auto" w:fill="auto"/>
-                <w:rtl w:val="0"/>
-                <w:lang w:val="en-US"/>
-              </w:rPr>
-              <w:t>/month.</w:t>
+              <w:t xml:space="preserve">Target </w:t>
+            </w:r>
+            <w:r>
+              <w:rPr>
+                <w:rFonts w:ascii="Helvetica Neue" w:hAnsi="Helvetica Neue"/>
+                <w:b w:val="1"/>
+                <w:bCs w:val="1"/>
+                <w:sz w:val="20"/>
+                <w:szCs w:val="20"/>
+                <w:shd w:val="nil" w:color="auto" w:fill="auto"/>
+                <w:rtl w:val="0"/>
+                <w:lang w:val="en-US"/>
+              </w:rPr>
+              <w:t>h</w:t>
+            </w:r>
+            <w:r>
+              <w:rPr>
+                <w:rFonts w:ascii="Helvetica Neue" w:hAnsi="Helvetica Neue"/>
+                <w:b w:val="1"/>
+                <w:bCs w:val="1"/>
+                <w:sz w:val="20"/>
+                <w:szCs w:val="20"/>
+                <w:shd w:val="nil" w:color="auto" w:fill="auto"/>
+                <w:rtl w:val="0"/>
+                <w:lang w:val="en-US"/>
+              </w:rPr>
+              <w:t>ealth/</w:t>
+            </w:r>
+            <w:r>
+              <w:rPr>
+                <w:rFonts w:ascii="Helvetica Neue" w:hAnsi="Helvetica Neue"/>
+                <w:b w:val="1"/>
+                <w:bCs w:val="1"/>
+                <w:sz w:val="20"/>
+                <w:szCs w:val="20"/>
+                <w:shd w:val="nil" w:color="auto" w:fill="auto"/>
+                <w:rtl w:val="0"/>
+                <w:lang w:val="en-US"/>
+              </w:rPr>
+              <w:t>p</w:t>
+            </w:r>
+            <w:r>
+              <w:rPr>
+                <w:rFonts w:ascii="Helvetica Neue" w:hAnsi="Helvetica Neue"/>
+                <w:b w:val="1"/>
+                <w:bCs w:val="1"/>
+                <w:sz w:val="20"/>
+                <w:szCs w:val="20"/>
+                <w:shd w:val="nil" w:color="auto" w:fill="auto"/>
+                <w:rtl w:val="0"/>
+                <w:lang w:val="en-US"/>
+              </w:rPr>
+              <w:t xml:space="preserve">ersonal </w:t>
+            </w:r>
+            <w:r>
+              <w:rPr>
+                <w:rFonts w:ascii="Helvetica Neue" w:hAnsi="Helvetica Neue"/>
+                <w:b w:val="1"/>
+                <w:bCs w:val="1"/>
+                <w:sz w:val="20"/>
+                <w:szCs w:val="20"/>
+                <w:shd w:val="nil" w:color="auto" w:fill="auto"/>
+                <w:rtl w:val="0"/>
+                <w:lang w:val="en-US"/>
+              </w:rPr>
+              <w:t>c</w:t>
+            </w:r>
+            <w:r>
+              <w:rPr>
+                <w:rFonts w:ascii="Helvetica Neue" w:hAnsi="Helvetica Neue"/>
+                <w:b w:val="1"/>
+                <w:bCs w:val="1"/>
+                <w:sz w:val="20"/>
+                <w:szCs w:val="20"/>
+                <w:shd w:val="nil" w:color="auto" w:fill="auto"/>
+                <w:rtl w:val="0"/>
+                <w:lang w:val="en-US"/>
+              </w:rPr>
+              <w:t>are ~{19}/month.</w:t>
             </w:r>
           </w:p>
         </w:tc>
       </w:tr>
     </w:tbl>
+    <w:p>
+      <w:pPr>
+        <w:pStyle w:val="Body A"/>
+        <w:widowControl w:val="0"/>
+        <w:spacing w:line="240" w:lineRule="auto"/>
+        <w:ind w:left="432" w:hanging="432"/>
+        <w:jc w:val="center"/>
+        <w:rPr>
+          <w:rFonts w:ascii="Helvetica Neue" w:cs="Helvetica Neue" w:hAnsi="Helvetica Neue" w:eastAsia="Helvetica Neue"/>
+          <w:b w:val="1"/>
+          <w:bCs w:val="1"/>
+          <w:sz w:val="20"/>
+          <w:szCs w:val="20"/>
+        </w:rPr>
+      </w:pPr>
+    </w:p>
     <w:p>
       <w:pPr>
         <w:pStyle w:val="Body A"/>
@@ -1846,7 +1701,7 @@
       <w:tblPr>
         <w:tblW w:w="8792" w:type="dxa"/>
         <w:jc w:val="center"/>
-        <w:tblInd w:w="432" w:type="dxa"/>
+        <w:tblInd w:w="540" w:type="dxa"/>
         <w:tblBorders>
           <w:top w:val="single" w:color="ffffff" w:sz="8" w:space="0" w:shadow="0" w:frame="0"/>
           <w:left w:val="single" w:color="ffffff" w:sz="8" w:space="0" w:shadow="0" w:frame="0"/>
@@ -1866,7 +1721,7 @@
           <w:shd w:val="clear" w:color="auto" w:fill="ced7e7"/>
         </w:tblPrEx>
         <w:trPr>
-          <w:trHeight w:val="314" w:hRule="atLeast"/>
+          <w:trHeight w:val="334" w:hRule="atLeast"/>
         </w:trPr>
         <w:tc>
           <w:tcPr>
@@ -1913,7 +1768,7 @@
           <w:shd w:val="clear" w:color="auto" w:fill="ced7e7"/>
         </w:tblPrEx>
         <w:trPr>
-          <w:trHeight w:val="4594" w:hRule="atLeast"/>
+          <w:trHeight w:val="4614" w:hRule="atLeast"/>
         </w:trPr>
         <w:tc>
           <w:tcPr>
@@ -1981,29 +1836,7 @@
                 <w:rtl w:val="0"/>
                 <w:lang w:val="en-US"/>
               </w:rPr>
-              <w:t>Right now, your top priorities are</w:t>
-            </w:r>
-            <w:r>
-              <w:rPr>
-                <w:rFonts w:ascii="Helvetica Neue" w:hAnsi="Helvetica Neue"/>
-                <w:sz w:val="20"/>
-                <w:szCs w:val="20"/>
-                <w:shd w:val="nil" w:color="auto" w:fill="auto"/>
-                <w:rtl w:val="0"/>
-                <w:lang w:val="en-US"/>
-              </w:rPr>
-              <w:t xml:space="preserve"> fully funding your</w:t>
-            </w:r>
-            <w:r>
-              <w:rPr>
-                <w:rFonts w:ascii="Helvetica Neue" w:hAnsi="Helvetica Neue"/>
-                <w:sz w:val="20"/>
-                <w:szCs w:val="20"/>
-                <w:shd w:val="nil" w:color="auto" w:fill="auto"/>
-                <w:rtl w:val="0"/>
-                <w:lang w:val="en-US"/>
-              </w:rPr>
-              <w:t xml:space="preserve"> {list_main}</w:t>
+              <w:t>Right now, your top priorities are fully funding your {list_main}</w:t>
             </w:r>
           </w:p>
           <w:p>
@@ -2019,8 +1852,8 @@
                 <w:bCs w:val="1"/>
                 <w:sz w:val="20"/>
                 <w:szCs w:val="20"/>
-                <w:rtl w:val="0"/>
-                <w:lang w:val="en-US"/>
+                <w:shd w:val="nil" w:color="auto" w:fill="auto"/>
+                <w:rtl w:val="0"/>
               </w:rPr>
             </w:pPr>
             <w:r>
@@ -2050,8 +1883,8 @@
                 <w:bCs w:val="1"/>
                 <w:sz w:val="20"/>
                 <w:szCs w:val="20"/>
-                <w:rtl w:val="0"/>
-                <w:lang w:val="en-US"/>
+                <w:shd w:val="nil" w:color="auto" w:fill="auto"/>
+                <w:rtl w:val="0"/>
               </w:rPr>
             </w:pPr>
             <w:r>
@@ -2081,8 +1914,8 @@
                 <w:bCs w:val="1"/>
                 <w:sz w:val="20"/>
                 <w:szCs w:val="20"/>
-                <w:rtl w:val="0"/>
-                <w:lang w:val="en-US"/>
+                <w:shd w:val="nil" w:color="auto" w:fill="auto"/>
+                <w:rtl w:val="0"/>
               </w:rPr>
             </w:pPr>
             <w:r>
@@ -2112,8 +1945,8 @@
                 <w:bCs w:val="1"/>
                 <w:sz w:val="20"/>
                 <w:szCs w:val="20"/>
-                <w:rtl w:val="0"/>
-                <w:lang w:val="en-US"/>
+                <w:shd w:val="nil" w:color="auto" w:fill="auto"/>
+                <w:rtl w:val="0"/>
               </w:rPr>
             </w:pPr>
             <w:r>
@@ -2143,8 +1976,8 @@
                 <w:bCs w:val="1"/>
                 <w:sz w:val="20"/>
                 <w:szCs w:val="20"/>
-                <w:rtl w:val="0"/>
-                <w:lang w:val="en-US"/>
+                <w:shd w:val="nil" w:color="auto" w:fill="auto"/>
+                <w:rtl w:val="0"/>
               </w:rPr>
             </w:pPr>
             <w:r>
@@ -2215,6 +2048,22 @@
         </w:tc>
       </w:tr>
     </w:tbl>
+    <w:p>
+      <w:pPr>
+        <w:pStyle w:val="Body A"/>
+        <w:widowControl w:val="0"/>
+        <w:spacing w:line="240" w:lineRule="auto"/>
+        <w:ind w:left="432" w:hanging="432"/>
+        <w:jc w:val="center"/>
+        <w:rPr>
+          <w:rFonts w:ascii="Helvetica Neue" w:cs="Helvetica Neue" w:hAnsi="Helvetica Neue" w:eastAsia="Helvetica Neue"/>
+          <w:b w:val="1"/>
+          <w:bCs w:val="1"/>
+          <w:sz w:val="20"/>
+          <w:szCs w:val="20"/>
+        </w:rPr>
+      </w:pPr>
+    </w:p>
     <w:p>
       <w:pPr>
         <w:pStyle w:val="Body A"/>
@@ -2310,7 +2159,7 @@
       <w:tblPr>
         <w:tblW w:w="8792" w:type="dxa"/>
         <w:jc w:val="center"/>
-        <w:tblInd w:w="432" w:type="dxa"/>
+        <w:tblInd w:w="540" w:type="dxa"/>
         <w:tblBorders>
           <w:top w:val="single" w:color="ffffff" w:sz="8" w:space="0" w:shadow="0" w:frame="0"/>
           <w:left w:val="single" w:color="ffffff" w:sz="8" w:space="0" w:shadow="0" w:frame="0"/>
@@ -2330,7 +2179,7 @@
           <w:shd w:val="clear" w:color="auto" w:fill="ced7e7"/>
         </w:tblPrEx>
         <w:trPr>
-          <w:trHeight w:val="314" w:hRule="atLeast"/>
+          <w:trHeight w:val="334" w:hRule="atLeast"/>
         </w:trPr>
         <w:tc>
           <w:tcPr>
@@ -2377,7 +2226,7 @@
           <w:shd w:val="clear" w:color="auto" w:fill="ced7e7"/>
         </w:tblPrEx>
         <w:trPr>
-          <w:trHeight w:val="3034" w:hRule="atLeast"/>
+          <w:trHeight w:val="3054" w:hRule="atLeast"/>
         </w:trPr>
         <w:tc>
           <w:tcPr>
@@ -2461,8 +2310,8 @@
                 <w:bCs w:val="1"/>
                 <w:sz w:val="20"/>
                 <w:szCs w:val="20"/>
-                <w:rtl w:val="0"/>
-                <w:lang w:val="en-US"/>
+                <w:shd w:val="nil" w:color="auto" w:fill="auto"/>
+                <w:rtl w:val="0"/>
               </w:rPr>
             </w:pPr>
             <w:r>
@@ -2492,8 +2341,8 @@
                 <w:bCs w:val="1"/>
                 <w:sz w:val="20"/>
                 <w:szCs w:val="20"/>
-                <w:rtl w:val="0"/>
-                <w:lang w:val="en-US"/>
+                <w:shd w:val="nil" w:color="auto" w:fill="auto"/>
+                <w:rtl w:val="0"/>
               </w:rPr>
             </w:pPr>
             <w:r>
@@ -2538,6 +2387,22 @@
         </w:tc>
       </w:tr>
     </w:tbl>
+    <w:p>
+      <w:pPr>
+        <w:pStyle w:val="Body A"/>
+        <w:widowControl w:val="0"/>
+        <w:spacing w:line="240" w:lineRule="auto"/>
+        <w:ind w:left="432" w:hanging="432"/>
+        <w:jc w:val="center"/>
+        <w:rPr>
+          <w:rFonts w:ascii="Helvetica Neue" w:cs="Helvetica Neue" w:hAnsi="Helvetica Neue" w:eastAsia="Helvetica Neue"/>
+          <w:b w:val="1"/>
+          <w:bCs w:val="1"/>
+          <w:sz w:val="20"/>
+          <w:szCs w:val="20"/>
+        </w:rPr>
+      </w:pPr>
+    </w:p>
     <w:p>
       <w:pPr>
         <w:pStyle w:val="Body A"/>
@@ -2631,7 +2496,7 @@
       <w:tblPr>
         <w:tblW w:w="8792" w:type="dxa"/>
         <w:jc w:val="center"/>
-        <w:tblInd w:w="432" w:type="dxa"/>
+        <w:tblInd w:w="540" w:type="dxa"/>
         <w:tblBorders>
           <w:top w:val="single" w:color="ffffff" w:sz="8" w:space="0" w:shadow="0" w:frame="0"/>
           <w:left w:val="single" w:color="ffffff" w:sz="8" w:space="0" w:shadow="0" w:frame="0"/>
@@ -2651,7 +2516,7 @@
           <w:shd w:val="clear" w:color="auto" w:fill="ced7e7"/>
         </w:tblPrEx>
         <w:trPr>
-          <w:trHeight w:val="314" w:hRule="atLeast"/>
+          <w:trHeight w:val="334" w:hRule="atLeast"/>
         </w:trPr>
         <w:tc>
           <w:tcPr>
@@ -2698,7 +2563,7 @@
           <w:shd w:val="clear" w:color="auto" w:fill="ced7e7"/>
         </w:tblPrEx>
         <w:trPr>
-          <w:trHeight w:val="4794" w:hRule="atLeast"/>
+          <w:trHeight w:val="4814" w:hRule="atLeast"/>
         </w:trPr>
         <w:tc>
           <w:tcPr>
@@ -2809,8 +2674,8 @@
                 <w:bCs w:val="1"/>
                 <w:sz w:val="20"/>
                 <w:szCs w:val="20"/>
-                <w:rtl w:val="0"/>
-                <w:lang w:val="en-US"/>
+                <w:shd w:val="nil" w:color="auto" w:fill="auto"/>
+                <w:rtl w:val="0"/>
               </w:rPr>
             </w:pPr>
             <w:r>
@@ -2840,8 +2705,8 @@
                 <w:bCs w:val="1"/>
                 <w:sz w:val="20"/>
                 <w:szCs w:val="20"/>
-                <w:rtl w:val="0"/>
-                <w:lang w:val="en-US"/>
+                <w:shd w:val="nil" w:color="auto" w:fill="auto"/>
+                <w:rtl w:val="0"/>
               </w:rPr>
             </w:pPr>
             <w:r>
@@ -2871,8 +2736,8 @@
                 <w:bCs w:val="1"/>
                 <w:sz w:val="20"/>
                 <w:szCs w:val="20"/>
-                <w:rtl w:val="0"/>
-                <w:lang w:val="en-US"/>
+                <w:shd w:val="nil" w:color="auto" w:fill="auto"/>
+                <w:rtl w:val="0"/>
               </w:rPr>
             </w:pPr>
             <w:r>
@@ -2902,8 +2767,8 @@
                 <w:bCs w:val="1"/>
                 <w:sz w:val="20"/>
                 <w:szCs w:val="20"/>
-                <w:rtl w:val="0"/>
-                <w:lang w:val="en-US"/>
+                <w:shd w:val="nil" w:color="auto" w:fill="auto"/>
+                <w:rtl w:val="0"/>
               </w:rPr>
             </w:pPr>
             <w:r>
@@ -2959,8 +2824,8 @@
                 <w:bCs w:val="1"/>
                 <w:sz w:val="20"/>
                 <w:szCs w:val="20"/>
-                <w:rtl w:val="0"/>
-                <w:lang w:val="en-US"/>
+                <w:shd w:val="nil" w:color="auto" w:fill="auto"/>
+                <w:rtl w:val="0"/>
               </w:rPr>
             </w:pPr>
             <w:r>
@@ -3005,6 +2870,22 @@
         </w:tc>
       </w:tr>
     </w:tbl>
+    <w:p>
+      <w:pPr>
+        <w:pStyle w:val="Body A"/>
+        <w:widowControl w:val="0"/>
+        <w:spacing w:line="240" w:lineRule="auto"/>
+        <w:ind w:left="432" w:hanging="432"/>
+        <w:jc w:val="center"/>
+        <w:rPr>
+          <w:rFonts w:ascii="Helvetica Neue" w:cs="Helvetica Neue" w:hAnsi="Helvetica Neue" w:eastAsia="Helvetica Neue"/>
+          <w:b w:val="1"/>
+          <w:bCs w:val="1"/>
+          <w:sz w:val="20"/>
+          <w:szCs w:val="20"/>
+        </w:rPr>
+      </w:pPr>
+    </w:p>
     <w:p>
       <w:pPr>
         <w:pStyle w:val="Body A"/>
@@ -3098,7 +2979,7 @@
       <w:tblPr>
         <w:tblW w:w="8792" w:type="dxa"/>
         <w:jc w:val="center"/>
-        <w:tblInd w:w="432" w:type="dxa"/>
+        <w:tblInd w:w="540" w:type="dxa"/>
         <w:tblBorders>
           <w:top w:val="single" w:color="ffffff" w:sz="8" w:space="0" w:shadow="0" w:frame="0"/>
           <w:left w:val="single" w:color="ffffff" w:sz="8" w:space="0" w:shadow="0" w:frame="0"/>
@@ -3118,7 +2999,7 @@
           <w:shd w:val="clear" w:color="auto" w:fill="ced7e7"/>
         </w:tblPrEx>
         <w:trPr>
-          <w:trHeight w:val="314" w:hRule="atLeast"/>
+          <w:trHeight w:val="334" w:hRule="atLeast"/>
         </w:trPr>
         <w:tc>
           <w:tcPr>
@@ -3166,7 +3047,7 @@
           <w:shd w:val="clear" w:color="auto" w:fill="ced7e7"/>
         </w:tblPrEx>
         <w:trPr>
-          <w:trHeight w:val="2994" w:hRule="atLeast"/>
+          <w:trHeight w:val="3014" w:hRule="atLeast"/>
         </w:trPr>
         <w:tc>
           <w:tcPr>
@@ -3326,8 +3207,8 @@
                 <w:bCs w:val="1"/>
                 <w:sz w:val="20"/>
                 <w:szCs w:val="20"/>
-                <w:rtl w:val="0"/>
-                <w:lang w:val="en-US"/>
+                <w:shd w:val="nil" w:color="auto" w:fill="auto"/>
+                <w:rtl w:val="0"/>
               </w:rPr>
             </w:pPr>
             <w:r>
@@ -3372,6 +3253,22 @@
         </w:tc>
       </w:tr>
     </w:tbl>
+    <w:p>
+      <w:pPr>
+        <w:pStyle w:val="Body A"/>
+        <w:widowControl w:val="0"/>
+        <w:spacing w:line="240" w:lineRule="auto"/>
+        <w:ind w:left="432" w:hanging="432"/>
+        <w:jc w:val="center"/>
+        <w:rPr>
+          <w:rFonts w:ascii="Helvetica Neue" w:cs="Helvetica Neue" w:hAnsi="Helvetica Neue" w:eastAsia="Helvetica Neue"/>
+          <w:b w:val="1"/>
+          <w:bCs w:val="1"/>
+          <w:sz w:val="20"/>
+          <w:szCs w:val="20"/>
+        </w:rPr>
+      </w:pPr>
+    </w:p>
     <w:p>
       <w:pPr>
         <w:pStyle w:val="Body A"/>
@@ -3465,7 +3362,7 @@
       <w:tblPr>
         <w:tblW w:w="8792" w:type="dxa"/>
         <w:jc w:val="center"/>
-        <w:tblInd w:w="432" w:type="dxa"/>
+        <w:tblInd w:w="540" w:type="dxa"/>
         <w:tblBorders>
           <w:top w:val="single" w:color="ffffff" w:sz="8" w:space="0" w:shadow="0" w:frame="0"/>
           <w:left w:val="single" w:color="ffffff" w:sz="8" w:space="0" w:shadow="0" w:frame="0"/>
@@ -3485,7 +3382,7 @@
           <w:shd w:val="clear" w:color="auto" w:fill="ced7e7"/>
         </w:tblPrEx>
         <w:trPr>
-          <w:trHeight w:val="314" w:hRule="atLeast"/>
+          <w:trHeight w:val="334" w:hRule="atLeast"/>
         </w:trPr>
         <w:tc>
           <w:tcPr>
@@ -3533,7 +3430,7 @@
           <w:shd w:val="clear" w:color="auto" w:fill="ced7e7"/>
         </w:tblPrEx>
         <w:trPr>
-          <w:trHeight w:val="4706" w:hRule="atLeast"/>
+          <w:trHeight w:val="4780" w:hRule="atLeast"/>
         </w:trPr>
         <w:tc>
           <w:tcPr>
@@ -3574,51 +3471,7 @@
                 <w:rtl w:val="0"/>
                 <w:lang w:val="en-US"/>
               </w:rPr>
-              <w:t xml:space="preserve">To fully fund retirement at {35}, you {36} today. You currently have </w:t>
-            </w:r>
-            <w:r>
-              <w:rPr>
-                <w:rFonts w:ascii="Helvetica Neue" w:hAnsi="Helvetica Neue"/>
-                <w:sz w:val="20"/>
-                <w:szCs w:val="20"/>
-                <w:shd w:val="nil" w:color="auto" w:fill="auto"/>
-                <w:rtl w:val="0"/>
-                <w:lang w:val="en-US"/>
-              </w:rPr>
-              <w:t>~</w:t>
-            </w:r>
-            <w:r>
-              <w:rPr>
-                <w:rFonts w:ascii="Helvetica Neue" w:hAnsi="Helvetica Neue"/>
-                <w:sz w:val="20"/>
-                <w:szCs w:val="20"/>
-                <w:shd w:val="nil" w:color="auto" w:fill="auto"/>
-                <w:rtl w:val="0"/>
-                <w:lang w:val="en-US"/>
-              </w:rPr>
-              <w:t xml:space="preserve">{40} of qualified retirement accounts, and </w:t>
-            </w:r>
-            <w:r>
-              <w:rPr>
-                <w:rFonts w:ascii="Helvetica Neue" w:hAnsi="Helvetica Neue"/>
-                <w:sz w:val="20"/>
-                <w:szCs w:val="20"/>
-                <w:shd w:val="nil" w:color="auto" w:fill="auto"/>
-                <w:rtl w:val="0"/>
-                <w:lang w:val="en-US"/>
-              </w:rPr>
-              <w:t>~</w:t>
-            </w:r>
-            <w:r>
-              <w:rPr>
-                <w:rFonts w:ascii="Helvetica Neue" w:hAnsi="Helvetica Neue"/>
-                <w:sz w:val="20"/>
-                <w:szCs w:val="20"/>
-                <w:shd w:val="nil" w:color="auto" w:fill="auto"/>
-                <w:rtl w:val="0"/>
-                <w:lang w:val="en-US"/>
-              </w:rPr>
-              <w:t xml:space="preserve">{41} of brokerage assets that could be earmarked for retirement. </w:t>
+              <w:t xml:space="preserve">To fully fund retirement at {35}, you {36} today. You currently have ~{40} of qualified retirement accounts, and ~{41} of brokerage assets that could be earmarked for retirement. </w:t>
             </w:r>
           </w:p>
           <w:p>
@@ -3645,7 +3498,29 @@
                 <w:rtl w:val="0"/>
                 <w:lang w:val="en-US"/>
               </w:rPr>
-              <w:t xml:space="preserve">To be on track for retirement at assuming some social security, you need to save {37} per year. </w:t>
+              <w:t>To be on track for retirement assuming</w:t>
+            </w:r>
+            <w:r>
+              <w:rPr>
+                <w:rFonts w:ascii="Helvetica Neue" w:hAnsi="Helvetica Neue"/>
+                <w:sz w:val="20"/>
+                <w:szCs w:val="20"/>
+                <w:shd w:val="nil" w:color="auto" w:fill="auto"/>
+                <w:rtl w:val="0"/>
+                <w:lang w:val="en-US"/>
+              </w:rPr>
+              <w:t xml:space="preserve"> you receive</w:t>
+            </w:r>
+            <w:r>
+              <w:rPr>
+                <w:rFonts w:ascii="Helvetica Neue" w:hAnsi="Helvetica Neue"/>
+                <w:sz w:val="20"/>
+                <w:szCs w:val="20"/>
+                <w:shd w:val="nil" w:color="auto" w:fill="auto"/>
+                <w:rtl w:val="0"/>
+                <w:lang w:val="en-US"/>
+              </w:rPr>
+              <w:t xml:space="preserve"> some social security, you need to save {37} per year. </w:t>
             </w:r>
           </w:p>
           <w:p>
@@ -3694,29 +3569,7 @@
                 <w:rtl w:val="0"/>
                 <w:lang w:val="en-US"/>
               </w:rPr>
-              <w:t xml:space="preserve">re currently saving </w:t>
-            </w:r>
-            <w:r>
-              <w:rPr>
-                <w:rFonts w:ascii="Helvetica Neue" w:hAnsi="Helvetica Neue"/>
-                <w:sz w:val="20"/>
-                <w:szCs w:val="20"/>
-                <w:shd w:val="nil" w:color="auto" w:fill="auto"/>
-                <w:rtl w:val="0"/>
-                <w:lang w:val="en-US"/>
-              </w:rPr>
-              <w:t>~</w:t>
-            </w:r>
-            <w:r>
-              <w:rPr>
-                <w:rFonts w:ascii="Helvetica Neue" w:hAnsi="Helvetica Neue"/>
-                <w:sz w:val="20"/>
-                <w:szCs w:val="20"/>
-                <w:shd w:val="nil" w:color="auto" w:fill="auto"/>
-                <w:rtl w:val="0"/>
-                <w:lang w:val="en-US"/>
-              </w:rPr>
-              <w:t xml:space="preserve">{38} which includes your 401(k) contributions, employer match, and Roth IRA. </w:t>
+              <w:t xml:space="preserve">re currently saving ~{38} which includes your 401(k) contributions, employer match, and Roth IRA. </w:t>
             </w:r>
           </w:p>
           <w:p>
@@ -3743,29 +3596,7 @@
                 <w:rtl w:val="0"/>
                 <w:lang w:val="en-US"/>
               </w:rPr>
-              <w:t xml:space="preserve">You need to save an extra </w:t>
-            </w:r>
-            <w:r>
-              <w:rPr>
-                <w:rFonts w:ascii="Helvetica Neue" w:hAnsi="Helvetica Neue"/>
-                <w:sz w:val="20"/>
-                <w:szCs w:val="20"/>
-                <w:shd w:val="nil" w:color="auto" w:fill="auto"/>
-                <w:rtl w:val="0"/>
-                <w:lang w:val="en-US"/>
-              </w:rPr>
-              <w:t>~</w:t>
-            </w:r>
-            <w:r>
-              <w:rPr>
-                <w:rFonts w:ascii="Helvetica Neue" w:hAnsi="Helvetica Neue"/>
-                <w:sz w:val="20"/>
-                <w:szCs w:val="20"/>
-                <w:shd w:val="nil" w:color="auto" w:fill="auto"/>
-                <w:rtl w:val="0"/>
-                <w:lang w:val="en-US"/>
-              </w:rPr>
-              <w:t xml:space="preserve">{39} per year. </w:t>
+              <w:t xml:space="preserve">You need to save an extra ~{39} per year. </w:t>
             </w:r>
           </w:p>
           <w:p>
@@ -3781,8 +3612,8 @@
                 <w:bCs w:val="1"/>
                 <w:sz w:val="20"/>
                 <w:szCs w:val="20"/>
-                <w:rtl w:val="0"/>
-                <w:lang w:val="en-US"/>
+                <w:shd w:val="nil" w:color="auto" w:fill="auto"/>
+                <w:rtl w:val="0"/>
               </w:rPr>
             </w:pPr>
             <w:r>
@@ -3814,15 +3645,17 @@
                 <w:iCs w:val="1"/>
                 <w:sz w:val="20"/>
                 <w:szCs w:val="20"/>
-                <w:rtl w:val="0"/>
-                <w:lang w:val="en-US"/>
-              </w:rPr>
-            </w:pPr>
-            <w:r>
-              <w:rPr>
-                <w:rFonts w:ascii="Helvetica Neue" w:hAnsi="Helvetica Neue"/>
-                <w:b w:val="1"/>
-                <w:bCs w:val="1"/>
+                <w:shd w:val="nil" w:color="auto" w:fill="auto"/>
+                <w:rtl w:val="0"/>
+              </w:rPr>
+            </w:pPr>
+            <w:r>
+              <w:rPr>
+                <w:rFonts w:ascii="Helvetica Neue" w:hAnsi="Helvetica Neue"/>
+                <w:b w:val="1"/>
+                <w:bCs w:val="1"/>
+                <w:i w:val="0"/>
+                <w:iCs w:val="0"/>
                 <w:sz w:val="20"/>
                 <w:szCs w:val="20"/>
                 <w:shd w:val="nil" w:color="auto" w:fill="auto"/>
@@ -3890,8 +3723,8 @@
                 <w:bCs w:val="1"/>
                 <w:sz w:val="20"/>
                 <w:szCs w:val="20"/>
-                <w:rtl w:val="0"/>
-                <w:lang w:val="en-US"/>
+                <w:shd w:val="nil" w:color="auto" w:fill="auto"/>
+                <w:rtl w:val="0"/>
               </w:rPr>
             </w:pPr>
             <w:r>
@@ -3988,6 +3821,22 @@
         </w:tc>
       </w:tr>
     </w:tbl>
+    <w:p>
+      <w:pPr>
+        <w:pStyle w:val="Body A"/>
+        <w:widowControl w:val="0"/>
+        <w:spacing w:line="240" w:lineRule="auto"/>
+        <w:ind w:left="432" w:hanging="432"/>
+        <w:jc w:val="center"/>
+        <w:rPr>
+          <w:rFonts w:ascii="Helvetica Neue" w:cs="Helvetica Neue" w:hAnsi="Helvetica Neue" w:eastAsia="Helvetica Neue"/>
+          <w:b w:val="1"/>
+          <w:bCs w:val="1"/>
+          <w:sz w:val="20"/>
+          <w:szCs w:val="20"/>
+        </w:rPr>
+      </w:pPr>
+    </w:p>
     <w:p>
       <w:pPr>
         <w:pStyle w:val="Body A"/>
@@ -4081,7 +3930,7 @@
       <w:tblPr>
         <w:tblW w:w="8792" w:type="dxa"/>
         <w:jc w:val="center"/>
-        <w:tblInd w:w="432" w:type="dxa"/>
+        <w:tblInd w:w="540" w:type="dxa"/>
         <w:tblBorders>
           <w:top w:val="single" w:color="ffffff" w:sz="8" w:space="0" w:shadow="0" w:frame="0"/>
           <w:left w:val="single" w:color="ffffff" w:sz="8" w:space="0" w:shadow="0" w:frame="0"/>
@@ -4101,7 +3950,7 @@
           <w:shd w:val="clear" w:color="auto" w:fill="ced7e7"/>
         </w:tblPrEx>
         <w:trPr>
-          <w:trHeight w:val="314" w:hRule="atLeast"/>
+          <w:trHeight w:val="334" w:hRule="atLeast"/>
         </w:trPr>
         <w:tc>
           <w:tcPr>
@@ -4148,7 +3997,7 @@
           <w:shd w:val="clear" w:color="auto" w:fill="ced7e7"/>
         </w:tblPrEx>
         <w:trPr>
-          <w:trHeight w:val="3795" w:hRule="atLeast"/>
+          <w:trHeight w:val="3815" w:hRule="atLeast"/>
         </w:trPr>
         <w:tc>
           <w:tcPr>
@@ -4205,8 +4054,8 @@
                 <w:bCs w:val="1"/>
                 <w:sz w:val="20"/>
                 <w:szCs w:val="20"/>
-                <w:rtl w:val="0"/>
-                <w:lang w:val="en-US"/>
+                <w:shd w:val="nil" w:color="auto" w:fill="auto"/>
+                <w:rtl w:val="0"/>
               </w:rPr>
             </w:pPr>
             <w:r>
@@ -4221,6 +4070,38 @@
                 <w:lang w:val="en-US"/>
               </w:rPr>
               <w:t xml:space="preserve">ACTION ITEMS: </w:t>
+            </w:r>
+          </w:p>
+          <w:p>
+            <w:pPr>
+              <w:pStyle w:val="Body A"/>
+              <w:bidi w:val="0"/>
+              <w:spacing w:after="200" w:line="240" w:lineRule="auto"/>
+              <w:ind w:left="0" w:right="0" w:firstLine="0"/>
+              <w:jc w:val="both"/>
+              <w:rPr>
+                <w:rFonts w:ascii="Helvetica Neue" w:cs="Helvetica Neue" w:hAnsi="Helvetica Neue" w:eastAsia="Helvetica Neue"/>
+                <w:b w:val="1"/>
+                <w:bCs w:val="1"/>
+                <w:sz w:val="20"/>
+                <w:szCs w:val="20"/>
+                <w:shd w:val="nil" w:color="auto" w:fill="auto"/>
+                <w:rtl w:val="0"/>
+                <w:lang w:val="en-US"/>
+              </w:rPr>
+            </w:pPr>
+            <w:r>
+              <w:rPr>
+                <w:rFonts w:ascii="Helvetica Neue" w:hAnsi="Helvetica Neue"/>
+                <w:b w:val="1"/>
+                <w:bCs w:val="1"/>
+                <w:sz w:val="20"/>
+                <w:szCs w:val="20"/>
+                <w:shd w:val="nil" w:color="auto" w:fill="auto"/>
+                <w:rtl w:val="0"/>
+                <w:lang w:val="en-US"/>
+              </w:rPr>
+              <w:t>Placeholder</w:t>
             </w:r>
           </w:p>
           <w:p>
@@ -4251,6 +4132,22 @@
         </w:tc>
       </w:tr>
     </w:tbl>
+    <w:p>
+      <w:pPr>
+        <w:pStyle w:val="Body A"/>
+        <w:widowControl w:val="0"/>
+        <w:spacing w:line="240" w:lineRule="auto"/>
+        <w:ind w:left="432" w:hanging="432"/>
+        <w:jc w:val="center"/>
+        <w:rPr>
+          <w:rFonts w:ascii="Helvetica Neue" w:cs="Helvetica Neue" w:hAnsi="Helvetica Neue" w:eastAsia="Helvetica Neue"/>
+          <w:b w:val="1"/>
+          <w:bCs w:val="1"/>
+          <w:sz w:val="20"/>
+          <w:szCs w:val="20"/>
+        </w:rPr>
+      </w:pPr>
+    </w:p>
     <w:p>
       <w:pPr>
         <w:pStyle w:val="Body A"/>
@@ -4344,7 +4241,7 @@
       <w:tblPr>
         <w:tblW w:w="8792" w:type="dxa"/>
         <w:jc w:val="center"/>
-        <w:tblInd w:w="432" w:type="dxa"/>
+        <w:tblInd w:w="540" w:type="dxa"/>
         <w:tblBorders>
           <w:top w:val="single" w:color="ffffff" w:sz="8" w:space="0" w:shadow="0" w:frame="0"/>
           <w:left w:val="single" w:color="ffffff" w:sz="8" w:space="0" w:shadow="0" w:frame="0"/>
@@ -4364,7 +4261,7 @@
           <w:shd w:val="clear" w:color="auto" w:fill="ced7e7"/>
         </w:tblPrEx>
         <w:trPr>
-          <w:trHeight w:val="314" w:hRule="atLeast"/>
+          <w:trHeight w:val="334" w:hRule="atLeast"/>
         </w:trPr>
         <w:tc>
           <w:tcPr>
@@ -4411,7 +4308,7 @@
           <w:shd w:val="clear" w:color="auto" w:fill="ced7e7"/>
         </w:tblPrEx>
         <w:trPr>
-          <w:trHeight w:val="7436" w:hRule="atLeast"/>
+          <w:trHeight w:val="7456" w:hRule="atLeast"/>
         </w:trPr>
         <w:tc>
           <w:tcPr>
@@ -4456,69 +4353,7 @@
                 <w:rtl w:val="0"/>
                 <w:lang w:val="en-US"/>
               </w:rPr>
-              <w:t xml:space="preserve">You have </w:t>
-            </w:r>
-            <w:r>
-              <w:rPr>
-                <w:rFonts w:ascii="Helvetica Neue" w:hAnsi="Helvetica Neue"/>
-                <w:b w:val="0"/>
-                <w:bCs w:val="0"/>
-                <w:sz w:val="20"/>
-                <w:szCs w:val="20"/>
-                <w:shd w:val="nil" w:color="auto" w:fill="auto"/>
-                <w:rtl w:val="0"/>
-                <w:lang w:val="en-US"/>
-              </w:rPr>
-              <w:t>X</w:t>
-            </w:r>
-            <w:r>
-              <w:rPr>
-                <w:rFonts w:ascii="Helvetica Neue" w:hAnsi="Helvetica Neue"/>
-                <w:b w:val="0"/>
-                <w:bCs w:val="0"/>
-                <w:sz w:val="20"/>
-                <w:szCs w:val="20"/>
-                <w:shd w:val="nil" w:color="auto" w:fill="auto"/>
-                <w:rtl w:val="0"/>
-                <w:lang w:val="en-US"/>
-              </w:rPr>
-              <w:t xml:space="preserve"> brokerage accoun</w:t>
-            </w:r>
-            <w:r>
-              <w:rPr>
-                <w:rFonts w:ascii="Helvetica Neue" w:hAnsi="Helvetica Neue"/>
-                <w:b w:val="0"/>
-                <w:bCs w:val="0"/>
-                <w:sz w:val="20"/>
-                <w:szCs w:val="20"/>
-                <w:rtl w:val="0"/>
-                <w:lang w:val="en-US"/>
-              </w:rPr>
-              <w:t>ts</w:t>
-            </w:r>
-            <w:r>
-              <w:rPr>
-                <w:rFonts w:ascii="Helvetica Neue" w:hAnsi="Helvetica Neue"/>
-                <w:b w:val="0"/>
-                <w:bCs w:val="0"/>
-                <w:sz w:val="20"/>
-                <w:szCs w:val="20"/>
-                <w:rtl w:val="0"/>
-                <w:lang w:val="en-US"/>
-              </w:rPr>
-              <w:t xml:space="preserve">. </w:t>
-            </w:r>
-            <w:r>
-              <w:rPr>
-                <w:rFonts w:ascii="Helvetica Neue" w:hAnsi="Helvetica Neue"/>
-                <w:b w:val="0"/>
-                <w:bCs w:val="0"/>
-                <w:sz w:val="20"/>
-                <w:szCs w:val="20"/>
-                <w:rtl w:val="0"/>
-                <w:lang w:val="en-US"/>
-              </w:rPr>
-              <w:t xml:space="preserve">The aggregate portfolio is {47} stocks, {48} bonds, and {49} cash. Of the stocks, {50} are US stocks and {51} are international stocks. </w:t>
+              <w:t xml:space="preserve">You have X brokerage accounts. The aggregate portfolio is {47} stocks, {48} bonds, and {49} cash. Of the stocks, {50} are US stocks and {51} are international stocks. </w:t>
             </w:r>
           </w:p>
           <w:p>
@@ -4534,8 +4369,8 @@
                 <w:bCs w:val="1"/>
                 <w:sz w:val="20"/>
                 <w:szCs w:val="20"/>
-                <w:rtl w:val="0"/>
-                <w:lang w:val="en-US"/>
+                <w:shd w:val="nil" w:color="auto" w:fill="auto"/>
+                <w:rtl w:val="0"/>
               </w:rPr>
             </w:pPr>
             <w:r>
@@ -4550,6 +4385,38 @@
                 <w:lang w:val="en-US"/>
               </w:rPr>
               <w:t xml:space="preserve">ACTION ITEMS: </w:t>
+            </w:r>
+          </w:p>
+          <w:p>
+            <w:pPr>
+              <w:pStyle w:val="Body A"/>
+              <w:bidi w:val="0"/>
+              <w:spacing w:after="200" w:line="240" w:lineRule="auto"/>
+              <w:ind w:left="0" w:right="0" w:firstLine="0"/>
+              <w:jc w:val="both"/>
+              <w:rPr>
+                <w:rFonts w:ascii="Helvetica Neue" w:cs="Helvetica Neue" w:hAnsi="Helvetica Neue" w:eastAsia="Helvetica Neue"/>
+                <w:b w:val="1"/>
+                <w:bCs w:val="1"/>
+                <w:sz w:val="20"/>
+                <w:szCs w:val="20"/>
+                <w:shd w:val="nil" w:color="auto" w:fill="auto"/>
+                <w:rtl w:val="0"/>
+                <w:lang w:val="en-US"/>
+              </w:rPr>
+            </w:pPr>
+            <w:r>
+              <w:rPr>
+                <w:rFonts w:ascii="Helvetica Neue" w:hAnsi="Helvetica Neue"/>
+                <w:b w:val="1"/>
+                <w:bCs w:val="1"/>
+                <w:sz w:val="20"/>
+                <w:szCs w:val="20"/>
+                <w:shd w:val="nil" w:color="auto" w:fill="auto"/>
+                <w:rtl w:val="0"/>
+                <w:lang w:val="en-US"/>
+              </w:rPr>
+              <w:t>Placeholder</w:t>
             </w:r>
           </w:p>
           <w:p>
@@ -4580,6 +4447,22 @@
         </w:tc>
       </w:tr>
     </w:tbl>
+    <w:p>
+      <w:pPr>
+        <w:pStyle w:val="Body A"/>
+        <w:widowControl w:val="0"/>
+        <w:spacing w:line="240" w:lineRule="auto"/>
+        <w:ind w:left="432" w:hanging="432"/>
+        <w:jc w:val="center"/>
+        <w:rPr>
+          <w:rFonts w:ascii="Helvetica Neue" w:cs="Helvetica Neue" w:hAnsi="Helvetica Neue" w:eastAsia="Helvetica Neue"/>
+          <w:b w:val="1"/>
+          <w:bCs w:val="1"/>
+          <w:sz w:val="20"/>
+          <w:szCs w:val="20"/>
+        </w:rPr>
+      </w:pPr>
+    </w:p>
     <w:p>
       <w:pPr>
         <w:pStyle w:val="Body A"/>
@@ -4673,7 +4556,7 @@
       <w:tblPr>
         <w:tblW w:w="8792" w:type="dxa"/>
         <w:jc w:val="center"/>
-        <w:tblInd w:w="432" w:type="dxa"/>
+        <w:tblInd w:w="540" w:type="dxa"/>
         <w:tblBorders>
           <w:top w:val="single" w:color="ffffff" w:sz="8" w:space="0" w:shadow="0" w:frame="0"/>
           <w:left w:val="single" w:color="ffffff" w:sz="8" w:space="0" w:shadow="0" w:frame="0"/>
@@ -4693,7 +4576,7 @@
           <w:shd w:val="clear" w:color="auto" w:fill="ced7e7"/>
         </w:tblPrEx>
         <w:trPr>
-          <w:trHeight w:val="314" w:hRule="atLeast"/>
+          <w:trHeight w:val="334" w:hRule="atLeast"/>
         </w:trPr>
         <w:tc>
           <w:tcPr>
@@ -4741,7 +4624,7 @@
           <w:shd w:val="clear" w:color="auto" w:fill="ced7e7"/>
         </w:tblPrEx>
         <w:trPr>
-          <w:trHeight w:val="5140" w:hRule="atLeast"/>
+          <w:trHeight w:val="5160" w:hRule="atLeast"/>
         </w:trPr>
         <w:tc>
           <w:tcPr>
@@ -4770,7 +4653,7 @@
                 <w:rFonts w:ascii="Helvetica Neue" w:cs="Helvetica Neue" w:hAnsi="Helvetica Neue" w:eastAsia="Helvetica Neue"/>
                 <w:sz w:val="20"/>
                 <w:szCs w:val="20"/>
-                <w:lang w:val="en-US"/>
+                <w:shd w:val="nil" w:color="auto" w:fill="auto"/>
               </w:rPr>
             </w:pPr>
             <w:r>
@@ -4788,13 +4671,16 @@
           <w:p>
             <w:pPr>
               <w:pStyle w:val="Body A"/>
+              <w:bidi w:val="0"/>
               <w:spacing w:after="200"/>
-              <w:jc w:val="both"/>
-              <w:rPr>
-                <w:rFonts w:ascii="Helvetica Neue" w:cs="Helvetica Neue" w:hAnsi="Helvetica Neue" w:eastAsia="Helvetica Neue"/>
-                <w:sz w:val="20"/>
-                <w:szCs w:val="20"/>
-                <w:lang w:val="en-US"/>
+              <w:ind w:left="0" w:right="0" w:firstLine="0"/>
+              <w:jc w:val="both"/>
+              <w:rPr>
+                <w:rFonts w:ascii="Helvetica Neue" w:cs="Helvetica Neue" w:hAnsi="Helvetica Neue" w:eastAsia="Helvetica Neue"/>
+                <w:sz w:val="20"/>
+                <w:szCs w:val="20"/>
+                <w:shd w:val="nil" w:color="auto" w:fill="auto"/>
+                <w:rtl w:val="0"/>
               </w:rPr>
             </w:pPr>
             <w:r>
@@ -4812,13 +4698,16 @@
           <w:p>
             <w:pPr>
               <w:pStyle w:val="Body A"/>
+              <w:bidi w:val="0"/>
               <w:spacing w:after="200"/>
-              <w:jc w:val="both"/>
-              <w:rPr>
-                <w:rFonts w:ascii="Helvetica Neue" w:cs="Helvetica Neue" w:hAnsi="Helvetica Neue" w:eastAsia="Helvetica Neue"/>
-                <w:sz w:val="20"/>
-                <w:szCs w:val="20"/>
-                <w:lang w:val="en-US"/>
+              <w:ind w:left="0" w:right="0" w:firstLine="0"/>
+              <w:jc w:val="both"/>
+              <w:rPr>
+                <w:rFonts w:ascii="Helvetica Neue" w:cs="Helvetica Neue" w:hAnsi="Helvetica Neue" w:eastAsia="Helvetica Neue"/>
+                <w:sz w:val="20"/>
+                <w:szCs w:val="20"/>
+                <w:shd w:val="nil" w:color="auto" w:fill="auto"/>
+                <w:rtl w:val="0"/>
               </w:rPr>
             </w:pPr>
             <w:r>
@@ -4836,13 +4725,16 @@
           <w:p>
             <w:pPr>
               <w:pStyle w:val="Body A"/>
+              <w:bidi w:val="0"/>
               <w:spacing w:after="200"/>
-              <w:jc w:val="both"/>
-              <w:rPr>
-                <w:rFonts w:ascii="Helvetica Neue" w:cs="Helvetica Neue" w:hAnsi="Helvetica Neue" w:eastAsia="Helvetica Neue"/>
-                <w:sz w:val="20"/>
-                <w:szCs w:val="20"/>
-                <w:lang w:val="en-US"/>
+              <w:ind w:left="0" w:right="0" w:firstLine="0"/>
+              <w:jc w:val="both"/>
+              <w:rPr>
+                <w:rFonts w:ascii="Helvetica Neue" w:cs="Helvetica Neue" w:hAnsi="Helvetica Neue" w:eastAsia="Helvetica Neue"/>
+                <w:sz w:val="20"/>
+                <w:szCs w:val="20"/>
+                <w:shd w:val="nil" w:color="auto" w:fill="auto"/>
+                <w:rtl w:val="0"/>
               </w:rPr>
             </w:pPr>
             <w:r>
@@ -4860,13 +4752,16 @@
           <w:p>
             <w:pPr>
               <w:pStyle w:val="Body A"/>
+              <w:bidi w:val="0"/>
               <w:spacing w:after="200"/>
-              <w:jc w:val="both"/>
-              <w:rPr>
-                <w:rFonts w:ascii="Helvetica Neue" w:cs="Helvetica Neue" w:hAnsi="Helvetica Neue" w:eastAsia="Helvetica Neue"/>
-                <w:sz w:val="20"/>
-                <w:szCs w:val="20"/>
-                <w:lang w:val="en-US"/>
+              <w:ind w:left="0" w:right="0" w:firstLine="0"/>
+              <w:jc w:val="both"/>
+              <w:rPr>
+                <w:rFonts w:ascii="Helvetica Neue" w:cs="Helvetica Neue" w:hAnsi="Helvetica Neue" w:eastAsia="Helvetica Neue"/>
+                <w:sz w:val="20"/>
+                <w:szCs w:val="20"/>
+                <w:shd w:val="nil" w:color="auto" w:fill="auto"/>
+                <w:rtl w:val="0"/>
               </w:rPr>
             </w:pPr>
             <w:r>
@@ -4884,13 +4779,16 @@
           <w:p>
             <w:pPr>
               <w:pStyle w:val="Body A"/>
+              <w:bidi w:val="0"/>
               <w:spacing w:after="200"/>
-              <w:jc w:val="both"/>
-              <w:rPr>
-                <w:rFonts w:ascii="Helvetica Neue" w:cs="Helvetica Neue" w:hAnsi="Helvetica Neue" w:eastAsia="Helvetica Neue"/>
-                <w:sz w:val="20"/>
-                <w:szCs w:val="20"/>
-                <w:shd w:val="nil" w:color="auto" w:fill="auto"/>
+              <w:ind w:left="0" w:right="0" w:firstLine="0"/>
+              <w:jc w:val="both"/>
+              <w:rPr>
+                <w:rFonts w:ascii="Helvetica Neue" w:cs="Helvetica Neue" w:hAnsi="Helvetica Neue" w:eastAsia="Helvetica Neue"/>
+                <w:sz w:val="20"/>
+                <w:szCs w:val="20"/>
+                <w:shd w:val="nil" w:color="auto" w:fill="auto"/>
+                <w:rtl w:val="0"/>
               </w:rPr>
             </w:pPr>
             <w:r>
@@ -4918,8 +4816,8 @@
                 <w:bCs w:val="1"/>
                 <w:sz w:val="20"/>
                 <w:szCs w:val="20"/>
-                <w:rtl w:val="0"/>
-                <w:lang w:val="en-US"/>
+                <w:shd w:val="nil" w:color="auto" w:fill="auto"/>
+                <w:rtl w:val="0"/>
               </w:rPr>
             </w:pPr>
             <w:r>
@@ -4949,8 +4847,8 @@
                 <w:bCs w:val="1"/>
                 <w:sz w:val="20"/>
                 <w:szCs w:val="20"/>
-                <w:rtl w:val="0"/>
-                <w:lang w:val="en-US"/>
+                <w:shd w:val="nil" w:color="auto" w:fill="auto"/>
+                <w:rtl w:val="0"/>
               </w:rPr>
             </w:pPr>
             <w:r>
@@ -4980,8 +4878,8 @@
                 <w:bCs w:val="1"/>
                 <w:sz w:val="20"/>
                 <w:szCs w:val="20"/>
-                <w:rtl w:val="0"/>
-                <w:lang w:val="en-US"/>
+                <w:shd w:val="nil" w:color="auto" w:fill="auto"/>
+                <w:rtl w:val="0"/>
               </w:rPr>
             </w:pPr>
             <w:r>
@@ -5012,8 +4910,8 @@
                 <w:bCs w:val="1"/>
                 <w:sz w:val="20"/>
                 <w:szCs w:val="20"/>
-                <w:rtl w:val="0"/>
-                <w:lang w:val="en-US"/>
+                <w:shd w:val="nil" w:color="auto" w:fill="auto"/>
+                <w:rtl w:val="0"/>
               </w:rPr>
             </w:pPr>
             <w:r>
@@ -5173,6 +5071,23 @@
         <w:pStyle w:val="Body A"/>
         <w:widowControl w:val="0"/>
         <w:spacing w:line="240" w:lineRule="auto"/>
+        <w:ind w:left="432" w:hanging="432"/>
+        <w:jc w:val="center"/>
+        <w:rPr>
+          <w:rStyle w:val="None"/>
+          <w:rFonts w:ascii="Helvetica Neue" w:cs="Helvetica Neue" w:hAnsi="Helvetica Neue" w:eastAsia="Helvetica Neue"/>
+          <w:b w:val="1"/>
+          <w:bCs w:val="1"/>
+          <w:sz w:val="20"/>
+          <w:szCs w:val="20"/>
+        </w:rPr>
+      </w:pPr>
+    </w:p>
+    <w:p>
+      <w:pPr>
+        <w:pStyle w:val="Body A"/>
+        <w:widowControl w:val="0"/>
+        <w:spacing w:line="240" w:lineRule="auto"/>
         <w:ind w:left="324" w:hanging="324"/>
         <w:jc w:val="center"/>
         <w:rPr>
@@ -5267,7 +5182,7 @@
       <w:tblPr>
         <w:tblW w:w="8792" w:type="dxa"/>
         <w:jc w:val="center"/>
-        <w:tblInd w:w="432" w:type="dxa"/>
+        <w:tblInd w:w="540" w:type="dxa"/>
         <w:tblBorders>
           <w:top w:val="single" w:color="ffffff" w:sz="8" w:space="0" w:shadow="0" w:frame="0"/>
           <w:left w:val="single" w:color="ffffff" w:sz="8" w:space="0" w:shadow="0" w:frame="0"/>
@@ -5287,7 +5202,7 @@
           <w:shd w:val="clear" w:color="auto" w:fill="ced7e7"/>
         </w:tblPrEx>
         <w:trPr>
-          <w:trHeight w:val="314" w:hRule="atLeast"/>
+          <w:trHeight w:val="334" w:hRule="atLeast"/>
         </w:trPr>
         <w:tc>
           <w:tcPr>
@@ -5336,7 +5251,7 @@
           <w:shd w:val="clear" w:color="auto" w:fill="ced7e7"/>
         </w:tblPrEx>
         <w:trPr>
-          <w:trHeight w:val="1980" w:hRule="atLeast"/>
+          <w:trHeight w:val="2000" w:hRule="atLeast"/>
         </w:trPr>
         <w:tc>
           <w:tcPr>
@@ -5429,8 +5344,8 @@
                 <w:bCs w:val="1"/>
                 <w:sz w:val="20"/>
                 <w:szCs w:val="20"/>
-                <w:rtl w:val="0"/>
-                <w:lang w:val="en-US"/>
+                <w:shd w:val="nil" w:color="auto" w:fill="auto"/>
+                <w:rtl w:val="0"/>
               </w:rPr>
             </w:pPr>
             <w:r>
@@ -5477,6 +5392,23 @@
         </w:tc>
       </w:tr>
     </w:tbl>
+    <w:p>
+      <w:pPr>
+        <w:pStyle w:val="Body A"/>
+        <w:widowControl w:val="0"/>
+        <w:spacing w:line="240" w:lineRule="auto"/>
+        <w:ind w:left="432" w:hanging="432"/>
+        <w:jc w:val="center"/>
+        <w:rPr>
+          <w:rStyle w:val="None"/>
+          <w:rFonts w:ascii="Helvetica Neue" w:cs="Helvetica Neue" w:hAnsi="Helvetica Neue" w:eastAsia="Helvetica Neue"/>
+          <w:b w:val="1"/>
+          <w:bCs w:val="1"/>
+          <w:sz w:val="20"/>
+          <w:szCs w:val="20"/>
+        </w:rPr>
+      </w:pPr>
+    </w:p>
     <w:p>
       <w:pPr>
         <w:pStyle w:val="Body A"/>
@@ -5981,7 +5913,7 @@
               <wp:positionV relativeFrom="page">
                 <wp:posOffset>231140</wp:posOffset>
               </wp:positionV>
-              <wp:extent cx="1700785" cy="1024131"/>
+              <wp:extent cx="1700787" cy="1024133"/>
               <wp:effectExtent l="0" t="0" r="0" b="0"/>
               <wp:wrapNone/>
               <wp:docPr id="1073741828" name="officeArt object" descr="Group 159"/>
@@ -5993,9 +5925,9 @@
                     <wpg:grpSpPr>
                       <a:xfrm>
                         <a:off x="0" y="0"/>
-                        <a:ext cx="1700785" cy="1024131"/>
-                        <a:chOff x="0" y="0"/>
-                        <a:chExt cx="1700784" cy="1024130"/>
+                        <a:ext cx="1700787" cy="1024133"/>
+                        <a:chOff x="0" y="-1"/>
+                        <a:chExt cx="1700786" cy="1024132"/>
                       </a:xfrm>
                     </wpg:grpSpPr>
                     <wps:wsp>
@@ -6004,7 +5936,7 @@
                       <wps:spPr>
                         <a:xfrm>
                           <a:off x="0" y="-1"/>
-                          <a:ext cx="1700785" cy="1024132"/>
+                          <a:ext cx="1700785" cy="1024133"/>
                         </a:xfrm>
                         <a:prstGeom prst="rect">
                           <a:avLst/>
@@ -6027,8 +5959,8 @@
                       <wps:cNvSpPr/>
                       <wps:spPr>
                         <a:xfrm>
-                          <a:off x="228598" y="-1"/>
-                          <a:ext cx="1463045" cy="1014989"/>
+                          <a:off x="228598" y="-2"/>
+                          <a:ext cx="1463046" cy="1014991"/>
                         </a:xfrm>
                         <a:custGeom>
                           <a:avLst/>
@@ -6087,7 +6019,7 @@
                       <wps:spPr>
                         <a:xfrm>
                           <a:off x="228599" y="-1"/>
-                          <a:ext cx="1472187" cy="1024132"/>
+                          <a:ext cx="1472188" cy="1024133"/>
                         </a:xfrm>
                         <a:prstGeom prst="rect">
                           <a:avLst/>
@@ -6115,17 +6047,17 @@
         </mc:Choice>
         <mc:Fallback>
           <w:pict>
-            <v:group id="_x0000_s1026" style="visibility:visible;position:absolute;margin-left:0.0pt;margin-top:18.2pt;width:133.9pt;height:80.6pt;z-index:-251658240;mso-position-horizontal:absolute;mso-position-horizontal-relative:page;mso-position-vertical:absolute;mso-position-vertical-relative:page;mso-wrap-distance-left:12.0pt;mso-wrap-distance-top:12.0pt;mso-wrap-distance-right:12.0pt;mso-wrap-distance-bottom:12.0pt;" coordorigin="0,0" coordsize="1700785,1024131">
+            <v:group id="_x0000_s1026" style="visibility:visible;position:absolute;margin-left:0.0pt;margin-top:18.2pt;width:133.9pt;height:80.6pt;z-index:-251658240;mso-position-horizontal:absolute;mso-position-horizontal-relative:page;mso-position-vertical:absolute;mso-position-vertical-relative:page;mso-wrap-distance-left:12.0pt;mso-wrap-distance-top:12.0pt;mso-wrap-distance-right:12.0pt;mso-wrap-distance-bottom:12.0pt;" coordorigin="0,-1" coordsize="1700786,1024132">
               <w10:wrap type="none" side="bothSides" anchorx="page" anchory="page"/>
-              <v:rect id="_x0000_s1027" style="position:absolute;left:0;top:0;width:1700785;height:1024131;">
+              <v:rect id="_x0000_s1027" style="position:absolute;left:0;top:-1;width:1700785;height:1024132;">
                 <v:fill color="#FFFFFF" opacity="0.0%" type="solid"/>
                 <v:stroke on="f" weight="1.0pt" dashstyle="solid" endcap="flat" miterlimit="400.0%" joinstyle="miter" linestyle="single" startarrow="none" startarrowwidth="medium" startarrowlength="medium" endarrow="none" endarrowwidth="medium" endarrowlength="medium"/>
               </v:rect>
-              <v:shape id="_x0000_s1028" style="position:absolute;left:228599;top:0;width:1463044;height:1014987;" coordorigin="0,0" coordsize="21600,21600" path="M 0,0 L 21600,0 L 13443,8012 L 0,21600 L 0,0 X E">
+              <v:shape id="_x0000_s1028" style="position:absolute;left:228598;top:-1;width:1463046;height:1014990;" coordorigin="0,0" coordsize="21600,21600" path="M 0,0 L 21600,0 L 13443,8012 L 0,21600 L 0,0 X E">
                 <v:fill color="#4F81BD" opacity="100.0%" type="solid"/>
                 <v:stroke on="f" weight="1.0pt" dashstyle="solid" endcap="flat" miterlimit="400.0%" joinstyle="miter" linestyle="single" startarrow="none" startarrowwidth="medium" startarrowlength="medium" endarrow="none" endarrowwidth="medium" endarrowlength="medium"/>
               </v:shape>
-              <v:rect id="_x0000_s1029" style="position:absolute;left:228600;top:0;width:1472185;height:1024131;">
+              <v:rect id="_x0000_s1029" style="position:absolute;left:228599;top:-1;width:1472187;height:1024132;">
                 <v:fill r:id="rId1" o:title="image1.png" rotate="t" type="frame"/>
                 <v:stroke on="f" weight="1.0pt" dashstyle="solid" endcap="flat" miterlimit="400.0%" joinstyle="miter" linestyle="single" startarrow="none" startarrowwidth="medium" startarrowlength="medium" endarrow="none" endarrowwidth="medium" endarrowlength="medium"/>
               </v:rect>

</xml_diff>